<commit_message>
Add Portuguese accents to proposal documents
Co-authored-by: Fred Alberto Tembe <Fredalbertomoz@gmail.com>
</commit_message>
<xml_diff>
--- a/docs/proposta-comercial-sistema-ginasio.docx
+++ b/docs/proposta-comercial-sistema-ginasio.docx
@@ -14,7 +14,7 @@
         </w:rPr>
         <w:t>Proposta Comercial</w:t>
         <w:br/>
-        <w:t>Sistema de Gestao para Ginasios</w:t>
+        <w:t>Sistema de Gestão para Ginásios</w:t>
       </w:r>
     </w:p>
     <w:p>
@@ -26,7 +26,7 @@
           <w:color w:val="505A64"/>
           <w:sz w:val="24"/>
         </w:rPr>
-        <w:t>Uma solucao para organizar clientes, pagamentos, acessos, caixa, vendas e acompanhamento do ginasio</w:t>
+        <w:t>Uma solução para organizar clientes, pagamentos, acessos, caixa, vendas e acompanhamento do ginásio</w:t>
       </w:r>
     </w:p>
     <w:p/>
@@ -35,17 +35,17 @@
         <w:pStyle w:val="Heading1"/>
       </w:pPr>
       <w:r>
-        <w:t>1. Apresentacao</w:t>
+        <w:t>1. Apresentação</w:t>
       </w:r>
     </w:p>
     <w:p>
       <w:r>
-        <w:t>Esta proposta apresenta um sistema de gestao completo para ginasios e academias, criado para ajudar no controlo diario da operacao, desde o cadastro dos clientes ate ao controlo de entradas, pagamentos, caixa, vendas, avaliacoes fisicas e relacionamento com os utentes.</w:t>
+        <w:t>Esta proposta apresenta um sistema de gestão completo para ginásios e academias, criado para ajudar no controlo diário da operação, desde o cadastro dos clientes até ao controlo de entradas, pagamentos, caixa, vendas, avaliações físicas e relacionamento com os utentes.</w:t>
       </w:r>
     </w:p>
     <w:p>
       <w:r>
-        <w:t>O objetivo e substituir controlos manuais, folhas soltas e processos desorganizados por uma ferramenta simples, segura e preparada para crescer junto com o negocio.</w:t>
+        <w:t>O objetivo é substituir controlos manuais, folhas soltas e processos desorganizados por uma ferramenta simples, segura e preparada para crescer junto com o negócio.</w:t>
       </w:r>
     </w:p>
     <w:p>
@@ -58,7 +58,7 @@
     </w:p>
     <w:p>
       <w:r>
-        <w:t>O sistema vai ajudar o ginasio a controlar:</w:t>
+        <w:t>O sistema vai ajudar o ginásio a controlar:</w:t>
       </w:r>
     </w:p>
     <w:p>
@@ -82,7 +82,7 @@
         <w:pStyle w:val="ListBullet"/>
       </w:pPr>
       <w:r>
-        <w:t>Pacotes diarios, semanais, quinzenais, mensais, anuais e avulsos.</w:t>
+        <w:t>Pacotes diários, semanais, quinzenais, mensais, anuais e avulsos.</w:t>
       </w:r>
     </w:p>
     <w:p>
@@ -90,7 +90,7 @@
         <w:pStyle w:val="ListBullet"/>
       </w:pPr>
       <w:r>
-        <w:t>Pagamentos e caixa diario.</w:t>
+        <w:t>Pagamentos e caixa diário.</w:t>
       </w:r>
     </w:p>
     <w:p>
@@ -106,7 +106,7 @@
         <w:pStyle w:val="ListBullet"/>
       </w:pPr>
       <w:r>
-        <w:t>Cartoes ou tags de acesso.</w:t>
+        <w:t>Cartões ou tags de acesso.</w:t>
       </w:r>
     </w:p>
     <w:p>
@@ -114,7 +114,7 @@
         <w:pStyle w:val="ListBullet"/>
       </w:pPr>
       <w:r>
-        <w:t>Produtos e servicos vendidos no ginasio.</w:t>
+        <w:t>Produtos e serviços vendidos no ginásio.</w:t>
       </w:r>
     </w:p>
     <w:p>
@@ -122,7 +122,7 @@
         <w:pStyle w:val="ListBullet"/>
       </w:pPr>
       <w:r>
-        <w:t>Avaliacoes fisicas dos utentes.</w:t>
+        <w:t>Avaliações físicas dos utentes.</w:t>
       </w:r>
     </w:p>
     <w:p>
@@ -130,7 +130,7 @@
         <w:pStyle w:val="ListBullet"/>
       </w:pPr>
       <w:r>
-        <w:t>Historico de cada cliente.</w:t>
+        <w:t>Histórico de cada cliente.</w:t>
       </w:r>
     </w:p>
     <w:p>
@@ -138,7 +138,7 @@
         <w:pStyle w:val="ListBullet"/>
       </w:pPr>
       <w:r>
-        <w:t>Mensagens, campanhas e bonus nas etapas futuras.</w:t>
+        <w:t>Mensagens, campanhas e bónus nas etapas futuras.</w:t>
       </w:r>
     </w:p>
     <w:p>
@@ -151,7 +151,7 @@
     </w:p>
     <w:p>
       <w:r>
-        <w:t>Em resumo, o sistema vai permitir que o ginasio saiba quem esta cadastrado, quem esta ativo, quem esta em atraso, quem pode entrar, quanto entrou no caixa, quais produtos foram vendidos e como esta a evolucao dos utentes.</w:t>
+        <w:t>Em resumo, o sistema vai permitir que o ginásio saiba quem está cadastrado, quem está ativo, quem está em atraso, quem pode entrar, quanto entrou no caixa, quais produtos foram vendidos e como está a evolução dos utentes.</w:t>
       </w:r>
     </w:p>
     <w:p>
@@ -159,7 +159,7 @@
         <w:pStyle w:val="Heading1"/>
       </w:pPr>
       <w:r>
-        <w:t>3. Principais beneficios para o ginasio</w:t>
+        <w:t>3. Principais benefícios para o ginásio</w:t>
       </w:r>
     </w:p>
     <w:p>
@@ -167,7 +167,7 @@
         <w:pStyle w:val="ListBullet"/>
       </w:pPr>
       <w:r>
-        <w:t>Mais controlo sobre clientes, contratos, pagamentos, acessos, produtos, servicos e caixa.</w:t>
+        <w:t>Mais controlo sobre clientes, contratos, pagamentos, acessos, produtos, serviços e caixa.</w:t>
       </w:r>
     </w:p>
     <w:p>
@@ -183,7 +183,7 @@
         <w:pStyle w:val="ListBullet"/>
       </w:pPr>
       <w:r>
-        <w:t>Atendimento mais profissional, com historico organizado de cada cliente.</w:t>
+        <w:t>Atendimento mais profissional, com histórico organizado de cada cliente.</w:t>
       </w:r>
     </w:p>
     <w:p>
@@ -191,7 +191,7 @@
         <w:pStyle w:val="ListBullet"/>
       </w:pPr>
       <w:r>
-        <w:t>Melhor acompanhamento dos clientes atraves de avaliacoes fisicas e historico de frequencia.</w:t>
+        <w:t>Melhor acompanhamento dos clientes através de avaliações físicas e histórico de frequência.</w:t>
       </w:r>
     </w:p>
     <w:p>
@@ -199,7 +199,7 @@
         <w:pStyle w:val="ListBullet"/>
       </w:pPr>
       <w:r>
-        <w:t>Crescimento organizado, com evolucao por etapas ate web, CRM, SMS e mobile.</w:t>
+        <w:t>Crescimento organizado, com evolução por etapas até web, CRM, SMS e mobile.</w:t>
       </w:r>
     </w:p>
     <w:p>
@@ -207,12 +207,12 @@
         <w:pStyle w:val="Heading1"/>
       </w:pPr>
       <w:r>
-        <w:t>4. Divisao do projeto em etapas</w:t>
+        <w:t>4. Divisão do projeto em etapas</w:t>
       </w:r>
     </w:p>
     <w:p>
       <w:r>
-        <w:t>O projeto sera desenvolvido em tres etapas para reduzir riscos, facilitar a validacao e permitir que o ginasio comece a usar primeiro as funcionalidades mais importantes.</w:t>
+        <w:t>O projeto será desenvolvido em três etapas para reduzir riscos, facilitar a validação e permitir que o ginásio comece a usar primeiro as funcionalidades mais importantes.</w:t>
       </w:r>
     </w:p>
     <w:p>
@@ -220,17 +220,17 @@
         <w:pStyle w:val="Heading1"/>
       </w:pPr>
       <w:r>
-        <w:t>5. Etapa 1 - Sistema base para uso no ginasio</w:t>
+        <w:t>5. Etapa 1 - Sistema base para uso no ginásio</w:t>
       </w:r>
     </w:p>
     <w:p>
       <w:r>
-        <w:t>Objetivo: criar a primeira versao do sistema para uso interno no ginasio, funcionando no computador da recepcao ou administracao.</w:t>
+        <w:t>Objetivo: criar a primeira versão do sistema para uso interno no ginásio, funcionando no computador da recepção ou administração.</w:t>
       </w:r>
     </w:p>
     <w:p>
       <w:r>
-        <w:t>Nesta etapa, o sistema nao dependera de painel web, CRM, aplicativo mobile ou integracao com outros ginasios. O foco sera entregar a base principal para o ginasio operar no dia a dia.</w:t>
+        <w:t>Nesta etapa, o sistema não dependerá de painel web, CRM, aplicativo mobile ou integração com outros ginásios. O foco será entregar a base principal para o ginásio operar no dia a dia.</w:t>
       </w:r>
     </w:p>
     <w:p>
@@ -246,7 +246,7 @@
         <w:pStyle w:val="ListBullet"/>
       </w:pPr>
       <w:r>
-        <w:t>Cadastro de usuarios, perfis e permissoes.</w:t>
+        <w:t>Cadastro de usuários, perfis e permissões.</w:t>
       </w:r>
     </w:p>
     <w:p>
@@ -286,7 +286,7 @@
         <w:pStyle w:val="ListBullet"/>
       </w:pPr>
       <w:r>
-        <w:t>Cadastro e venda de produtos e servicos.</w:t>
+        <w:t>Cadastro e venda de produtos e serviços.</w:t>
       </w:r>
     </w:p>
     <w:p>
@@ -302,7 +302,7 @@
         <w:pStyle w:val="ListBullet"/>
       </w:pPr>
       <w:r>
-        <w:t>Cartoes ou tags de acesso.</w:t>
+        <w:t>Cartões ou tags de acesso.</w:t>
       </w:r>
     </w:p>
     <w:p>
@@ -318,7 +318,7 @@
         <w:pStyle w:val="ListBullet"/>
       </w:pPr>
       <w:r>
-        <w:t>Avaliacoes fisicas/check-ups.</w:t>
+        <w:t>Avaliações físicas/check-ups.</w:t>
       </w:r>
     </w:p>
     <w:p>
@@ -326,7 +326,7 @@
         <w:pStyle w:val="ListBullet"/>
       </w:pPr>
       <w:r>
-        <w:t>Relatorios basicos.</w:t>
+        <w:t>Relatórios básicos.</w:t>
       </w:r>
     </w:p>
     <w:p>
@@ -342,7 +342,7 @@
         <w:pStyle w:val="Heading2"/>
       </w:pPr>
       <w:r>
-        <w:t>O que ainda nao entra nesta etapa</w:t>
+        <w:t>O que ainda não entra nesta etapa</w:t>
       </w:r>
     </w:p>
     <w:p>
@@ -366,7 +366,7 @@
         <w:pStyle w:val="ListBullet"/>
       </w:pPr>
       <w:r>
-        <w:t>Envio automatico de SMS.</w:t>
+        <w:t>Envio automático de SMS.</w:t>
       </w:r>
     </w:p>
     <w:p>
@@ -382,7 +382,7 @@
         <w:pStyle w:val="ListBullet"/>
       </w:pPr>
       <w:r>
-        <w:t>Integracao entre varios ginasios.</w:t>
+        <w:t>Integração entre vários ginásios.</w:t>
       </w:r>
     </w:p>
     <w:p>
@@ -408,7 +408,7 @@
     </w:p>
     <w:p>
       <w:r>
-        <w:t>Objetivo: permitir que o dono ou gestor acompanhe o andamento do ginasio remotamente e melhorar o relacionamento com os clientes.</w:t>
+        <w:t>Objetivo: permitir que o dono ou gestor acompanhe o andamento do ginásio remotamente e melhorar o relacionamento com os clientes.</w:t>
       </w:r>
     </w:p>
     <w:p>
@@ -424,7 +424,7 @@
         <w:pStyle w:val="ListBullet"/>
       </w:pPr>
       <w:r>
-        <w:t>Visao de clientes ativos e inativos.</w:t>
+        <w:t>Visão de clientes ativos e inativos.</w:t>
       </w:r>
     </w:p>
     <w:p>
@@ -432,7 +432,7 @@
         <w:pStyle w:val="ListBullet"/>
       </w:pPr>
       <w:r>
-        <w:t>Visao de pagamentos, caixa e vendas.</w:t>
+        <w:t>Visão de pagamentos, caixa e vendas.</w:t>
       </w:r>
     </w:p>
     <w:p>
@@ -448,7 +448,7 @@
         <w:pStyle w:val="ListBullet"/>
       </w:pPr>
       <w:r>
-        <w:t>Acompanhamento de entradas no ginasio.</w:t>
+        <w:t>Acompanhamento de entradas no ginásio.</w:t>
       </w:r>
     </w:p>
     <w:p>
@@ -464,7 +464,7 @@
         <w:pStyle w:val="ListBullet"/>
       </w:pPr>
       <w:r>
-        <w:t>Campanhas promocionais e atribuicao de bonus.</w:t>
+        <w:t>Campanhas promocionais e atribuicao de bónus.</w:t>
       </w:r>
     </w:p>
     <w:p>
@@ -472,12 +472,12 @@
         <w:pStyle w:val="ListBullet"/>
       </w:pPr>
       <w:r>
-        <w:t>Envio de SMS para boas-vindas, vencimentos, ausencias, aniversarios, avaliacoes e reativacao.</w:t>
+        <w:t>Envio de SMS para boas-vindas, vencimentos, ausências, aniversários, avaliações e reativação.</w:t>
       </w:r>
     </w:p>
     <w:p>
       <w:r>
-        <w:t>Exemplo: se um cliente ficar muitos dias sem ir ao ginasio, o sistema podera avisar a equipa ou enviar uma mensagem automatica incentivando o retorno aos treinos.</w:t>
+        <w:t>Exemplo: se um cliente ficar muitos dias sem ir ao ginásio, o sistema poderá avisar a equipa ou enviar uma mensagem automática incentivando o retorno aos treinos.</w:t>
       </w:r>
     </w:p>
     <w:p>
@@ -495,7 +495,7 @@
     </w:p>
     <w:p>
       <w:r>
-        <w:t>Objetivo: criar um aplicativo para que os utentes possam acompanhar as suas informacoes pelo telemovel.</w:t>
+        <w:t>Objetivo: criar um aplicativo para que os utentes possam acompanhar as suas informações pelo telemóvel.</w:t>
       </w:r>
     </w:p>
     <w:p>
@@ -519,7 +519,7 @@
         <w:pStyle w:val="ListBullet"/>
       </w:pPr>
       <w:r>
-        <w:t>Historico de pagamentos e entradas.</w:t>
+        <w:t>Histórico de pagamentos e entradas.</w:t>
       </w:r>
     </w:p>
     <w:p>
@@ -527,7 +527,7 @@
         <w:pStyle w:val="ListBullet"/>
       </w:pPr>
       <w:r>
-        <w:t>Evolucao fisica e avaliacoes/check-ups.</w:t>
+        <w:t>Evolucao física e avaliações/check-ups.</w:t>
       </w:r>
     </w:p>
     <w:p>
@@ -535,7 +535,7 @@
         <w:pStyle w:val="ListBullet"/>
       </w:pPr>
       <w:r>
-        <w:t>Bonus, campanhas e notificacoes.</w:t>
+        <w:t>Bónus, campanhas e notificações.</w:t>
       </w:r>
     </w:p>
     <w:p>
@@ -604,7 +604,7 @@
                 <w:b/>
                 <w:sz w:val="20"/>
               </w:rPr>
-              <w:t>O que sera entregue</w:t>
+              <w:t>O que será entregue</w:t>
             </w:r>
           </w:p>
         </w:tc>
@@ -658,7 +658,7 @@
                 <w:b w:val="0"/>
                 <w:sz w:val="20"/>
               </w:rPr>
-              <w:t>Sistema base para uso interno no ginasio</w:t>
+              <w:t>Sistema base para uso interno no ginásio</w:t>
             </w:r>
           </w:p>
         </w:tc>
@@ -819,7 +819,7 @@
                 <w:b/>
                 <w:sz w:val="20"/>
               </w:rPr>
-              <w:t>Sistema completo nas tres etapas</w:t>
+              <w:t>Sistema completo nas três etapas</w:t>
             </w:r>
           </w:p>
         </w:tc>
@@ -845,7 +845,7 @@
     </w:tbl>
     <w:p>
       <w:r>
-        <w:t>As estimativas acima sao em dias de trabalho, considerando uma rotina de 9 horas por dia e 5 dias por semana.</w:t>
+        <w:t>As estimativas acima são em dias de trabalho, considerando uma rotina de 9 horas por dia e 5 dias por semana.</w:t>
       </w:r>
     </w:p>
     <w:p>
@@ -861,7 +861,7 @@
         <w:pStyle w:val="ListBullet"/>
       </w:pPr>
       <w:r>
-        <w:t>Comecar pelo que e mais importante.</w:t>
+        <w:t>Começar pelo que e mais importante.</w:t>
       </w:r>
     </w:p>
     <w:p>
@@ -885,7 +885,7 @@
         <w:pStyle w:val="ListBullet"/>
       </w:pPr>
       <w:r>
-        <w:t>Permitir que o ginasio comece a usar o sistema mais cedo.</w:t>
+        <w:t>Permitir que o ginásio comece a usar o sistema mais cedo.</w:t>
       </w:r>
     </w:p>
     <w:p>
@@ -901,7 +901,7 @@
         <w:pStyle w:val="ListBullet"/>
       </w:pPr>
       <w:r>
-        <w:t>Deixar as funcoes mais avancadas para depois da base estar estavel.</w:t>
+        <w:t>Deixar as funções mais avançadas para depois da base estar estável.</w:t>
       </w:r>
     </w:p>
     <w:p>
@@ -914,12 +914,12 @@
     </w:p>
     <w:p>
       <w:r>
-        <w:t>No final da primeira etapa, o ginasio ja devera conseguir cadastrar clientes, controlar planos e contratos, receber pagamentos, controlar caixa, vender produtos e servicos, registar entradas, acompanhar avaliacoes fisicas, saber quem esta ativo ou vencido e guardar backup na nuvem.</w:t>
+        <w:t>No final da primeira etapa, o ginásio já deverá conseguir cadastrar clientes, controlar planos e contratos, receber pagamentos, controlar caixa, vender produtos e serviços, registar entradas, acompanhar avaliações físicas, saber quem está ativo ou vencido e guardar backup na nuvem.</w:t>
       </w:r>
     </w:p>
     <w:p>
       <w:r>
-        <w:t>Ou seja, a primeira etapa ja entrega uma ferramenta util para a operacao diaria do ginasio.</w:t>
+        <w:t>Ou seja, a primeira etapa já entrega uma ferramenta util para a operação diaria do ginásio.</w:t>
       </w:r>
     </w:p>
     <w:p>
@@ -927,7 +927,7 @@
         <w:pStyle w:val="Heading1"/>
       </w:pPr>
       <w:r>
-        <w:t>11. Observacoes importantes</w:t>
+        <w:t>11. Observações importantes</w:t>
       </w:r>
     </w:p>
     <w:p>
@@ -943,7 +943,7 @@
         <w:pStyle w:val="ListBullet"/>
       </w:pPr>
       <w:r>
-        <w:t>Relatorios, regras especificas de caixa e recibos podem alterar o esforco.</w:t>
+        <w:t>Relatórios, regras específicas de caixa e recibos podem alterár o esforco.</w:t>
       </w:r>
     </w:p>
     <w:p>
@@ -951,7 +951,7 @@
         <w:pStyle w:val="ListBullet"/>
       </w:pPr>
       <w:r>
-        <w:t>O tipo de cartao/tag ou catraca usado pode influenciar a implementacao.</w:t>
+        <w:t>O tipo de cartão/tag ou catraca usado pode influenciar a implementacao.</w:t>
       </w:r>
     </w:p>
     <w:p>
@@ -975,7 +975,7 @@
         <w:pStyle w:val="ListBullet"/>
       </w:pPr>
       <w:r>
-        <w:t>Importacao de dados antigos e ajustes solicitados durante a validacao podem impactar o prazo.</w:t>
+        <w:t>Importação de dados antigos e ajustes solicitados durante a validação podem impactar o prazo.</w:t>
       </w:r>
     </w:p>
     <w:p>
@@ -983,17 +983,17 @@
         <w:pStyle w:val="Heading1"/>
       </w:pPr>
       <w:r>
-        <w:t>12. Conclusao</w:t>
+        <w:t>12. Conclusão</w:t>
       </w:r>
     </w:p>
     <w:p>
       <w:r>
-        <w:t>Este sistema sera uma solucao completa para profissionalizar a gestao do ginasio, melhorar o controlo financeiro, organizar o atendimento, acompanhar os clientes e preparar o negocio para crescer.</w:t>
+        <w:t>Este sistema será uma solução completa para profissionalizar a gestão do ginásio, melhorar o controlo financeiro, organizar o atendimento, acompanhar os clientes e preparar o negócio para crescer.</w:t>
       </w:r>
     </w:p>
     <w:p>
       <w:r>
-        <w:t>A recomendacao e iniciar pela primeira etapa, com o sistema base para uso interno, e depois evoluir para painel web, CRM, SMS e aplicativo mobile.</w:t>
+        <w:t>A recomendação é iniciar pela primeira etapa, com o sistema base para uso interno, e depois evoluir para painel web, CRM, SMS e aplicativo mobile.</w:t>
       </w:r>
     </w:p>
     <w:p>
@@ -1011,7 +1011,7 @@
           <w:color w:val="28313B"/>
           <w:sz w:val="21"/>
         </w:rPr>
-        <w:t>A primeira entrega pode ficar entre 25 e 40 dias de trabalho. O sistema completo, nas tres etapas, pode ficar entre 70 e 110 dias de trabalho, considerando 9 horas por dia e 5 dias por semana.</w:t>
+        <w:t>A primeira entrega pode ficar entre 25 e 40 dias de trabalho. O sistema completo, nas três etapas, pode ficar entre 70 e 110 dias de trabalho, considerando 9 horas por dia e 5 dias por semana.</w:t>
       </w:r>
     </w:p>
     <w:sectPr>

</xml_diff>

<commit_message>
Tailor commercial proposal for DP Gym
Co-authored-by: Fred Alberto Tembe <Fredalbertomoz@gmail.com>
</commit_message>
<xml_diff>
--- a/docs/proposta-comercial-sistema-ginasio.docx
+++ b/docs/proposta-comercial-sistema-ginasio.docx
@@ -10,11 +10,24 @@
         <w:rPr>
           <w:b/>
           <w:color w:val="0E2340"/>
-          <w:sz w:val="48"/>
+          <w:sz w:val="52"/>
         </w:rPr>
+        <w:t>DP Gym</w:t>
+        <w:br/>
         <w:t>Proposta Comercial</w:t>
-        <w:br/>
-        <w:t>Sistema de Gestão para Ginásios</w:t>
+      </w:r>
+    </w:p>
+    <w:p>
+      <w:pPr>
+        <w:jc w:val="center"/>
+      </w:pPr>
+      <w:r>
+        <w:rPr>
+          <w:b/>
+          <w:color w:val="F19430"/>
+          <w:sz w:val="32"/>
+        </w:rPr>
+        <w:t>Sistema de Gestão para Ginásio</w:t>
       </w:r>
     </w:p>
     <w:p>
@@ -26,39 +39,52 @@
           <w:color w:val="505A64"/>
           <w:sz w:val="24"/>
         </w:rPr>
-        <w:t>Uma solução para organizar clientes, pagamentos, acessos, caixa, vendas e acompanhamento do ginásio</w:t>
+        <w:t>Fitness and Wellness</w:t>
       </w:r>
     </w:p>
     <w:p/>
     <w:p>
       <w:pPr>
-        <w:pStyle w:val="Heading1"/>
+        <w:jc w:val="center"/>
       </w:pPr>
       <w:r>
-        <w:t>1. Apresentação</w:t>
+        <w:rPr>
+          <w:i/>
+          <w:color w:val="646464"/>
+          <w:sz w:val="18"/>
+        </w:rPr>
+        <w:t>Nota: inserir o logotipo oficial da DP Gym na capa da versão final.</w:t>
       </w:r>
     </w:p>
     <w:p>
       <w:r>
-        <w:t>Esta proposta apresenta um sistema de gestão completo para ginásios e academias, criado para ajudar no controlo diário da operação, desde o cadastro dos clientes até ao controlo de entradas, pagamentos, caixa, vendas, avaliações físicas e relacionamento com os utentes.</w:t>
+        <w:br w:type="page"/>
+      </w:r>
+    </w:p>
+    <w:p>
+      <w:pPr>
+        <w:pStyle w:val="Heading1"/>
+      </w:pPr>
+      <w:r>
+        <w:t>1. O problema atual</w:t>
       </w:r>
     </w:p>
     <w:p>
       <w:r>
-        <w:t>O objetivo é substituir controlos manuais, folhas soltas e processos desorganizados por uma ferramenta simples, segura e preparada para crescer junto com o negócio.</w:t>
-      </w:r>
-    </w:p>
-    <w:p>
-      <w:pPr>
-        <w:pStyle w:val="Heading1"/>
-      </w:pPr>
-      <w:r>
-        <w:t>2. O que o sistema vai fazer</w:t>
+        <w:rPr>
+          <w:b w:val="0"/>
+          <w:i w:val="0"/>
+        </w:rPr>
+        <w:t>Muitos ginásios começam com processos simples: fichas em papel, folhas de Excel, mensagens manuais, controlo visual de entradas, pagamentos registados de forma separada e pouca informação consolidada sobre os clientes.</w:t>
       </w:r>
     </w:p>
     <w:p>
       <w:r>
-        <w:t>O sistema vai ajudar o ginásio a controlar:</w:t>
+        <w:rPr>
+          <w:b w:val="0"/>
+          <w:i w:val="0"/>
+        </w:rPr>
+        <w:t>Com o crescimento da operação, isso começa a gerar problemas:</w:t>
       </w:r>
     </w:p>
     <w:p>
@@ -66,7 +92,7 @@
         <w:pStyle w:val="ListBullet"/>
       </w:pPr>
       <w:r>
-        <w:t>Clientes/utentes.</w:t>
+        <w:t>dificuldade em saber rapidamente quem tem contrato ativo;</w:t>
       </w:r>
     </w:p>
     <w:p>
@@ -74,7 +100,7 @@
         <w:pStyle w:val="ListBullet"/>
       </w:pPr>
       <w:r>
-        <w:t>Contratos e mensalidades.</w:t>
+        <w:t>risco de permitir entrada de utentes com pagamento vencido;</w:t>
       </w:r>
     </w:p>
     <w:p>
@@ -82,7 +108,7 @@
         <w:pStyle w:val="ListBullet"/>
       </w:pPr>
       <w:r>
-        <w:t>Pacotes diários, semanais, quinzenais, mensais, anuais e avulsos.</w:t>
+        <w:t>dificuldade em controlar caixa, vendas e pagamentos;</w:t>
       </w:r>
     </w:p>
     <w:p>
@@ -90,7 +116,7 @@
         <w:pStyle w:val="ListBullet"/>
       </w:pPr>
       <w:r>
-        <w:t>Pagamentos e caixa diário.</w:t>
+        <w:t>perda de histórico dos utentes;</w:t>
       </w:r>
     </w:p>
     <w:p>
@@ -98,7 +124,7 @@
         <w:pStyle w:val="ListBullet"/>
       </w:pPr>
       <w:r>
-        <w:t>Entrada de utentes e colaboradores.</w:t>
+        <w:t>dificuldade em acompanhar avaliações físicas e evolução dos clientes;</w:t>
       </w:r>
     </w:p>
     <w:p>
@@ -106,7 +132,7 @@
         <w:pStyle w:val="ListBullet"/>
       </w:pPr>
       <w:r>
-        <w:t>Cartões ou tags de acesso.</w:t>
+        <w:t>pouca visibilidade sobre clientes ausentes;</w:t>
       </w:r>
     </w:p>
     <w:p>
@@ -114,7 +140,7 @@
         <w:pStyle w:val="ListBullet"/>
       </w:pPr>
       <w:r>
-        <w:t>Produtos e serviços vendidos no ginásio.</w:t>
+        <w:t>falta de alertas para mensalidades a vencer;</w:t>
       </w:r>
     </w:p>
     <w:p>
@@ -122,7 +148,7 @@
         <w:pStyle w:val="ListBullet"/>
       </w:pPr>
       <w:r>
-        <w:t>Avaliações físicas dos utentes.</w:t>
+        <w:t>comunicação manual e pouco organizada com os utentes;</w:t>
       </w:r>
     </w:p>
     <w:p>
@@ -130,7 +156,7 @@
         <w:pStyle w:val="ListBullet"/>
       </w:pPr>
       <w:r>
-        <w:t>Histórico de cada cliente.</w:t>
+        <w:t>dificuldade em acompanhar o desempenho do ginásio à distância;</w:t>
       </w:r>
     </w:p>
     <w:p>
@@ -138,20 +164,16 @@
         <w:pStyle w:val="ListBullet"/>
       </w:pPr>
       <w:r>
-        <w:t>Mensagens, campanhas e bónus nas etapas futuras.</w:t>
-      </w:r>
-    </w:p>
-    <w:p>
-      <w:pPr>
-        <w:pStyle w:val="ListBullet"/>
-      </w:pPr>
-      <w:r>
-        <w:t>Acompanhamento remoto e aplicativo mobile nas etapas futuras.</w:t>
+        <w:t>maior dependência de pessoas específicas para consultar informações.</w:t>
       </w:r>
     </w:p>
     <w:p>
       <w:r>
-        <w:t>Em resumo, o sistema vai permitir que o ginásio saiba quem está cadastrado, quem está ativo, quem está em atraso, quem pode entrar, quanto entrou no caixa, quais produtos foram vendidos e como está a evolução dos utentes.</w:t>
+        <w:rPr>
+          <w:b w:val="0"/>
+          <w:i w:val="0"/>
+        </w:rPr>
+        <w:t>Na prática, o ginásio pode perder dinheiro, tempo e controlo operacional quando as informações não estão centralizadas num sistema próprio.</w:t>
       </w:r>
     </w:p>
     <w:p>
@@ -159,86 +181,138 @@
         <w:pStyle w:val="Heading1"/>
       </w:pPr>
       <w:r>
-        <w:t>3. Principais benefícios para o ginásio</w:t>
-      </w:r>
-    </w:p>
-    <w:p>
-      <w:pPr>
-        <w:pStyle w:val="ListBullet"/>
-      </w:pPr>
-      <w:r>
-        <w:t>Mais controlo sobre clientes, contratos, pagamentos, acessos, produtos, serviços e caixa.</w:t>
-      </w:r>
-    </w:p>
-    <w:p>
-      <w:pPr>
-        <w:pStyle w:val="ListBullet"/>
-      </w:pPr>
-      <w:r>
-        <w:t>Menos perdas financeiras, ajudando a identificar mensalidades vencidas e entradas indevidas.</w:t>
-      </w:r>
-    </w:p>
-    <w:p>
-      <w:pPr>
-        <w:pStyle w:val="ListBullet"/>
-      </w:pPr>
-      <w:r>
-        <w:t>Atendimento mais profissional, com histórico organizado de cada cliente.</w:t>
-      </w:r>
-    </w:p>
-    <w:p>
-      <w:pPr>
-        <w:pStyle w:val="ListBullet"/>
-      </w:pPr>
-      <w:r>
-        <w:t>Melhor acompanhamento dos clientes através de avaliações físicas e histórico de frequência.</w:t>
-      </w:r>
-    </w:p>
-    <w:p>
-      <w:pPr>
-        <w:pStyle w:val="ListBullet"/>
-      </w:pPr>
-      <w:r>
-        <w:t>Crescimento organizado, com evolução por etapas até web, CRM, SMS e mobile.</w:t>
-      </w:r>
-    </w:p>
-    <w:p>
-      <w:pPr>
-        <w:pStyle w:val="Heading1"/>
-      </w:pPr>
-      <w:r>
-        <w:t>4. Divisão do projeto em etapas</w:t>
+        <w:t>2. O que pretendemos oferecer como solução</w:t>
       </w:r>
     </w:p>
     <w:p>
       <w:r>
-        <w:t>O projeto será desenvolvido em três etapas para reduzir riscos, facilitar a validação e permitir que o ginásio comece a usar primeiro as funcionalidades mais importantes.</w:t>
-      </w:r>
-    </w:p>
-    <w:p>
-      <w:pPr>
-        <w:pStyle w:val="Heading1"/>
-      </w:pPr>
-      <w:r>
-        <w:t>5. Etapa 1 - Sistema base para uso no ginásio</w:t>
+        <w:rPr>
+          <w:b w:val="0"/>
+          <w:i w:val="0"/>
+        </w:rPr>
+        <w:t>Pretendemos oferecer à DP Gym um sistema de gestão completo, dividido em etapas, começando por uma versão desktop para uso interno no ginásio e evoluindo depois para acompanhamento web, CRM, SMS e aplicativo mobile para os utentes.</w:t>
       </w:r>
     </w:p>
     <w:p>
       <w:r>
-        <w:t>Objetivo: criar a primeira versão do sistema para uso interno no ginásio, funcionando no computador da recepção ou administração.</w:t>
+        <w:rPr>
+          <w:b w:val="0"/>
+          <w:i w:val="0"/>
+        </w:rPr>
+        <w:t>A solução permitirá controlar:</w:t>
+      </w:r>
+    </w:p>
+    <w:p>
+      <w:pPr>
+        <w:pStyle w:val="ListBullet"/>
+      </w:pPr>
+      <w:r>
+        <w:t>cadastro de utentes;</w:t>
+      </w:r>
+    </w:p>
+    <w:p>
+      <w:pPr>
+        <w:pStyle w:val="ListBullet"/>
+      </w:pPr>
+      <w:r>
+        <w:t>contratos e subscrições;</w:t>
+      </w:r>
+    </w:p>
+    <w:p>
+      <w:pPr>
+        <w:pStyle w:val="ListBullet"/>
+      </w:pPr>
+      <w:r>
+        <w:t>pacotes diários, semanais, quinzenais, mensais, anuais e avulsos;</w:t>
+      </w:r>
+    </w:p>
+    <w:p>
+      <w:pPr>
+        <w:pStyle w:val="ListBullet"/>
+      </w:pPr>
+      <w:r>
+        <w:t>pagamentos e caixa;</w:t>
+      </w:r>
+    </w:p>
+    <w:p>
+      <w:pPr>
+        <w:pStyle w:val="ListBullet"/>
+      </w:pPr>
+      <w:r>
+        <w:t>produtos e serviços vendidos no ginásio;</w:t>
+      </w:r>
+    </w:p>
+    <w:p>
+      <w:pPr>
+        <w:pStyle w:val="ListBullet"/>
+      </w:pPr>
+      <w:r>
+        <w:t>cartões/tags de acesso;</w:t>
+      </w:r>
+    </w:p>
+    <w:p>
+      <w:pPr>
+        <w:pStyle w:val="ListBullet"/>
+      </w:pPr>
+      <w:r>
+        <w:t>entradas de utentes e colaboradores;</w:t>
+      </w:r>
+    </w:p>
+    <w:p>
+      <w:pPr>
+        <w:pStyle w:val="ListBullet"/>
+      </w:pPr>
+      <w:r>
+        <w:t>avaliações físicas e evolução;</w:t>
+      </w:r>
+    </w:p>
+    <w:p>
+      <w:pPr>
+        <w:pStyle w:val="ListBullet"/>
+      </w:pPr>
+      <w:r>
+        <w:t>backup na nuvem;</w:t>
+      </w:r>
+    </w:p>
+    <w:p>
+      <w:pPr>
+        <w:pStyle w:val="ListBullet"/>
+      </w:pPr>
+      <w:r>
+        <w:t>CRM, campanhas, bónus e SMS nas fases seguintes;</w:t>
+      </w:r>
+    </w:p>
+    <w:p>
+      <w:pPr>
+        <w:pStyle w:val="ListBullet"/>
+      </w:pPr>
+      <w:r>
+        <w:t>painel web para acompanhamento remoto nas fases seguintes;</w:t>
+      </w:r>
+    </w:p>
+    <w:p>
+      <w:pPr>
+        <w:pStyle w:val="ListBullet"/>
+      </w:pPr>
+      <w:r>
+        <w:t>aplicativo mobile para os utentes nas fases seguintes.</w:t>
       </w:r>
     </w:p>
     <w:p>
       <w:r>
-        <w:t>Nesta etapa, o sistema não dependerá de painel web, CRM, aplicativo mobile ou integração com outros ginásios. O foco será entregar a base principal para o ginásio operar no dia a dia.</w:t>
+        <w:rPr>
+          <w:b w:val="0"/>
+          <w:i w:val="0"/>
+        </w:rPr>
+        <w:t>O objetivo é que a DP Gym tenha uma ferramenta que responda a perguntas simples e importantes:</w:t>
       </w:r>
     </w:p>
     <w:p>
       <w:pPr>
-        <w:pStyle w:val="Heading2"/>
+        <w:pStyle w:val="ListBullet"/>
       </w:pPr>
       <w:r>
-        <w:t>O que entra nesta etapa</w:t>
+        <w:t>Quem pode entrar hoje?</w:t>
       </w:r>
     </w:p>
     <w:p>
@@ -246,7 +320,7 @@
         <w:pStyle w:val="ListBullet"/>
       </w:pPr>
       <w:r>
-        <w:t>Cadastro de usuários, perfis e permissões.</w:t>
+        <w:t>Quem está com pagamento em atraso?</w:t>
       </w:r>
     </w:p>
     <w:p>
@@ -254,7 +328,7 @@
         <w:pStyle w:val="ListBullet"/>
       </w:pPr>
       <w:r>
-        <w:t>Cadastro de utentes/clientes.</w:t>
+        <w:t>Quanto entrou no caixa?</w:t>
       </w:r>
     </w:p>
     <w:p>
@@ -262,7 +336,7 @@
         <w:pStyle w:val="ListBullet"/>
       </w:pPr>
       <w:r>
-        <w:t>Cadastro de pacotes, planos e contratos.</w:t>
+        <w:t>Quais produtos foram vendidos?</w:t>
       </w:r>
     </w:p>
     <w:p>
@@ -270,7 +344,7 @@
         <w:pStyle w:val="ListBullet"/>
       </w:pPr>
       <w:r>
-        <w:t>Pagamentos de mensalidades, anuidades e planos avulsos.</w:t>
+        <w:t>Quais utentes estão ausentes?</w:t>
       </w:r>
     </w:p>
     <w:p>
@@ -278,7 +352,7 @@
         <w:pStyle w:val="ListBullet"/>
       </w:pPr>
       <w:r>
-        <w:t>Controlo de caixa.</w:t>
+        <w:t>Quais contratos estão a vencer?</w:t>
       </w:r>
     </w:p>
     <w:p>
@@ -286,7 +360,7 @@
         <w:pStyle w:val="ListBullet"/>
       </w:pPr>
       <w:r>
-        <w:t>Cadastro e venda de produtos e serviços.</w:t>
+        <w:t>Como está a evolução física de cada utente?</w:t>
       </w:r>
     </w:p>
     <w:p>
@@ -294,269 +368,24 @@
         <w:pStyle w:val="ListBullet"/>
       </w:pPr>
       <w:r>
-        <w:t>Controlo de movimentos de produtos.</w:t>
+        <w:t>Como está o crescimento do ginásio?</w:t>
       </w:r>
     </w:p>
     <w:p>
       <w:pPr>
-        <w:pStyle w:val="ListBullet"/>
+        <w:pStyle w:val="Heading1"/>
       </w:pPr>
       <w:r>
-        <w:t>Cartões ou tags de acesso.</w:t>
-      </w:r>
-    </w:p>
-    <w:p>
-      <w:pPr>
-        <w:pStyle w:val="ListBullet"/>
-      </w:pPr>
-      <w:r>
-        <w:t>Registo de entradas de utentes e colaboradores.</w:t>
-      </w:r>
-    </w:p>
-    <w:p>
-      <w:pPr>
-        <w:pStyle w:val="ListBullet"/>
-      </w:pPr>
-      <w:r>
-        <w:t>Avaliações físicas/check-ups.</w:t>
-      </w:r>
-    </w:p>
-    <w:p>
-      <w:pPr>
-        <w:pStyle w:val="ListBullet"/>
-      </w:pPr>
-      <w:r>
-        <w:t>Relatórios básicos.</w:t>
-      </w:r>
-    </w:p>
-    <w:p>
-      <w:pPr>
-        <w:pStyle w:val="ListBullet"/>
-      </w:pPr>
-      <w:r>
-        <w:t>Backup na nuvem.</w:t>
-      </w:r>
-    </w:p>
-    <w:p>
-      <w:pPr>
-        <w:pStyle w:val="Heading2"/>
-      </w:pPr>
-      <w:r>
-        <w:t>O que ainda não entra nesta etapa</w:t>
-      </w:r>
-    </w:p>
-    <w:p>
-      <w:pPr>
-        <w:pStyle w:val="ListBullet"/>
-      </w:pPr>
-      <w:r>
-        <w:t>Painel web.</w:t>
-      </w:r>
-    </w:p>
-    <w:p>
-      <w:pPr>
-        <w:pStyle w:val="ListBullet"/>
-      </w:pPr>
-      <w:r>
-        <w:t>CRM.</w:t>
-      </w:r>
-    </w:p>
-    <w:p>
-      <w:pPr>
-        <w:pStyle w:val="ListBullet"/>
-      </w:pPr>
-      <w:r>
-        <w:t>Envio automático de SMS.</w:t>
-      </w:r>
-    </w:p>
-    <w:p>
-      <w:pPr>
-        <w:pStyle w:val="ListBullet"/>
-      </w:pPr>
-      <w:r>
-        <w:t>Aplicativo mobile.</w:t>
-      </w:r>
-    </w:p>
-    <w:p>
-      <w:pPr>
-        <w:pStyle w:val="ListBullet"/>
-      </w:pPr>
-      <w:r>
-        <w:t>Integração entre vários ginásios.</w:t>
-      </w:r>
-    </w:p>
-    <w:p>
-      <w:pPr>
-        <w:pStyle w:val="ListBullet"/>
-      </w:pPr>
-      <w:r>
-        <w:t>Pagamentos feitos pelo app mobile.</w:t>
+        <w:t>3. Visão geral das etapas</w:t>
       </w:r>
     </w:p>
     <w:p>
       <w:r>
-        <w:t>Estimativa: 25 a 40 dias de trabalho.</w:t>
-      </w:r>
-    </w:p>
-    <w:p>
-      <w:pPr>
-        <w:pStyle w:val="Heading1"/>
-      </w:pPr>
-      <w:r>
-        <w:t>6. Etapa 2 - Acompanhamento remoto, CRM e mensagens</w:t>
-      </w:r>
-    </w:p>
-    <w:p>
-      <w:r>
-        <w:t>Objetivo: permitir que o dono ou gestor acompanhe o andamento do ginásio remotamente e melhorar o relacionamento com os clientes.</w:t>
-      </w:r>
-    </w:p>
-    <w:p>
-      <w:pPr>
-        <w:pStyle w:val="ListBullet"/>
-      </w:pPr>
-      <w:r>
-        <w:t>Painel web para acompanhamento remoto.</w:t>
-      </w:r>
-    </w:p>
-    <w:p>
-      <w:pPr>
-        <w:pStyle w:val="ListBullet"/>
-      </w:pPr>
-      <w:r>
-        <w:t>Visão de clientes ativos e inativos.</w:t>
-      </w:r>
-    </w:p>
-    <w:p>
-      <w:pPr>
-        <w:pStyle w:val="ListBullet"/>
-      </w:pPr>
-      <w:r>
-        <w:t>Visão de pagamentos, caixa e vendas.</w:t>
-      </w:r>
-    </w:p>
-    <w:p>
-      <w:pPr>
-        <w:pStyle w:val="ListBullet"/>
-      </w:pPr>
-      <w:r>
-        <w:t>Acompanhamento de contratos vencidos.</w:t>
-      </w:r>
-    </w:p>
-    <w:p>
-      <w:pPr>
-        <w:pStyle w:val="ListBullet"/>
-      </w:pPr>
-      <w:r>
-        <w:t>Acompanhamento de entradas no ginásio.</w:t>
-      </w:r>
-    </w:p>
-    <w:p>
-      <w:pPr>
-        <w:pStyle w:val="ListBullet"/>
-      </w:pPr>
-      <w:r>
-        <w:t>CRM para relacionamento com clientes.</w:t>
-      </w:r>
-    </w:p>
-    <w:p>
-      <w:pPr>
-        <w:pStyle w:val="ListBullet"/>
-      </w:pPr>
-      <w:r>
-        <w:t>Campanhas promocionais e atribuicao de bónus.</w:t>
-      </w:r>
-    </w:p>
-    <w:p>
-      <w:pPr>
-        <w:pStyle w:val="ListBullet"/>
-      </w:pPr>
-      <w:r>
-        <w:t>Envio de SMS para boas-vindas, vencimentos, ausências, aniversários, avaliações e reativação.</w:t>
-      </w:r>
-    </w:p>
-    <w:p>
-      <w:r>
-        <w:t>Exemplo: se um cliente ficar muitos dias sem ir ao ginásio, o sistema poderá avisar a equipa ou enviar uma mensagem automática incentivando o retorno aos treinos.</w:t>
-      </w:r>
-    </w:p>
-    <w:p>
-      <w:r>
-        <w:t>Estimativa: 25 a 40 dias de trabalho.</w:t>
-      </w:r>
-    </w:p>
-    <w:p>
-      <w:pPr>
-        <w:pStyle w:val="Heading1"/>
-      </w:pPr>
-      <w:r>
-        <w:t>7. Etapa 3 - Aplicativo mobile para os utentes</w:t>
-      </w:r>
-    </w:p>
-    <w:p>
-      <w:r>
-        <w:t>Objetivo: criar um aplicativo para que os utentes possam acompanhar as suas informações pelo telemóvel.</w:t>
-      </w:r>
-    </w:p>
-    <w:p>
-      <w:pPr>
-        <w:pStyle w:val="ListBullet"/>
-      </w:pPr>
-      <w:r>
-        <w:t>Acesso do utente pelo aplicativo.</w:t>
-      </w:r>
-    </w:p>
-    <w:p>
-      <w:pPr>
-        <w:pStyle w:val="ListBullet"/>
-      </w:pPr>
-      <w:r>
-        <w:t>Visualizacao do contrato atual e validade da mensalidade ou plano.</w:t>
-      </w:r>
-    </w:p>
-    <w:p>
-      <w:pPr>
-        <w:pStyle w:val="ListBullet"/>
-      </w:pPr>
-      <w:r>
-        <w:t>Histórico de pagamentos e entradas.</w:t>
-      </w:r>
-    </w:p>
-    <w:p>
-      <w:pPr>
-        <w:pStyle w:val="ListBullet"/>
-      </w:pPr>
-      <w:r>
-        <w:t>Evolucao física e avaliações/check-ups.</w:t>
-      </w:r>
-    </w:p>
-    <w:p>
-      <w:pPr>
-        <w:pStyle w:val="ListBullet"/>
-      </w:pPr>
-      <w:r>
-        <w:t>Bónus, campanhas e notificações.</w:t>
-      </w:r>
-    </w:p>
-    <w:p>
-      <w:pPr>
-        <w:pStyle w:val="ListBullet"/>
-      </w:pPr>
-      <w:r>
-        <w:t>Possibilidade de pagamento pelo aplicativo, se for definido um meio de pagamento.</w:t>
-      </w:r>
-    </w:p>
-    <w:p>
-      <w:r>
-        <w:t>Estimativa: 20 a 30 dias de trabalho.</w:t>
-      </w:r>
-    </w:p>
-    <w:p>
-      <w:pPr>
-        <w:pStyle w:val="Heading1"/>
-      </w:pPr>
-      <w:r>
-        <w:t>8. Resumo das etapas e estimativas</w:t>
+        <w:rPr>
+          <w:b w:val="0"/>
+          <w:i w:val="0"/>
+        </w:rPr>
+        <w:t>O projeto será dividido em três etapas para reduzir riscos, entregar valor mais cedo e permitir que a DP Gym valide o sistema por partes.</w:t>
       </w:r>
     </w:p>
     <w:tbl>
@@ -567,16 +396,16 @@
         <w:tblLook w:firstColumn="1" w:firstRow="1" w:lastColumn="0" w:lastRow="0" w:noHBand="0" w:noVBand="1" w:val="04A0"/>
       </w:tblPr>
       <w:tblGrid>
-        <w:gridCol w:w="3312"/>
-        <w:gridCol w:w="3312"/>
-        <w:gridCol w:w="3312"/>
+        <w:gridCol w:w="3360"/>
+        <w:gridCol w:w="3360"/>
+        <w:gridCol w:w="3360"/>
       </w:tblGrid>
       <w:tr>
         <w:tc>
           <w:tcPr>
-            <w:tcW w:type="dxa" w:w="3312"/>
+            <w:tcW w:type="dxa" w:w="3360"/>
             <w:vAlign w:val="center"/>
-            <w:shd w:fill="D9EAF7"/>
+            <w:shd w:fill="F7D9A8"/>
           </w:tcPr>
           <w:p>
             <w:r/>
@@ -592,9 +421,9 @@
         </w:tc>
         <w:tc>
           <w:tcPr>
-            <w:tcW w:type="dxa" w:w="3312"/>
+            <w:tcW w:type="dxa" w:w="3360"/>
             <w:vAlign w:val="center"/>
-            <w:shd w:fill="D9EAF7"/>
+            <w:shd w:fill="F7D9A8"/>
           </w:tcPr>
           <w:p>
             <w:r/>
@@ -604,15 +433,15 @@
                 <w:b/>
                 <w:sz w:val="20"/>
               </w:rPr>
-              <w:t>O que será entregue</w:t>
+              <w:t>Objetivo principal</w:t>
             </w:r>
           </w:p>
         </w:tc>
         <w:tc>
           <w:tcPr>
-            <w:tcW w:type="dxa" w:w="3312"/>
+            <w:tcW w:type="dxa" w:w="3360"/>
             <w:vAlign w:val="center"/>
-            <w:shd w:fill="D9EAF7"/>
+            <w:shd w:fill="F7D9A8"/>
           </w:tcPr>
           <w:p>
             <w:r/>
@@ -630,7 +459,7 @@
       <w:tr>
         <w:tc>
           <w:tcPr>
-            <w:tcW w:type="dxa" w:w="3312"/>
+            <w:tcW w:type="dxa" w:w="3360"/>
             <w:vAlign w:val="center"/>
           </w:tcPr>
           <w:p>
@@ -647,7 +476,7 @@
         </w:tc>
         <w:tc>
           <w:tcPr>
-            <w:tcW w:type="dxa" w:w="3312"/>
+            <w:tcW w:type="dxa" w:w="3360"/>
             <w:vAlign w:val="center"/>
           </w:tcPr>
           <w:p>
@@ -658,13 +487,13 @@
                 <w:b w:val="0"/>
                 <w:sz w:val="20"/>
               </w:rPr>
-              <w:t>Sistema base para uso interno no ginásio</w:t>
+              <w:t>Sistema desktop base para uso interno no ginásio</w:t>
             </w:r>
           </w:p>
         </w:tc>
         <w:tc>
           <w:tcPr>
-            <w:tcW w:type="dxa" w:w="3312"/>
+            <w:tcW w:type="dxa" w:w="3360"/>
             <w:vAlign w:val="center"/>
           </w:tcPr>
           <w:p>
@@ -683,7 +512,7 @@
       <w:tr>
         <w:tc>
           <w:tcPr>
-            <w:tcW w:type="dxa" w:w="3312"/>
+            <w:tcW w:type="dxa" w:w="3360"/>
             <w:vAlign w:val="center"/>
           </w:tcPr>
           <w:p>
@@ -700,7 +529,7 @@
         </w:tc>
         <w:tc>
           <w:tcPr>
-            <w:tcW w:type="dxa" w:w="3312"/>
+            <w:tcW w:type="dxa" w:w="3360"/>
             <w:vAlign w:val="center"/>
           </w:tcPr>
           <w:p>
@@ -711,13 +540,13 @@
                 <w:b w:val="0"/>
                 <w:sz w:val="20"/>
               </w:rPr>
-              <w:t>Painel web, acompanhamento remoto, CRM e SMS</w:t>
+              <w:t>Painel web, Web API, CRM, campanhas e SMS</w:t>
             </w:r>
           </w:p>
         </w:tc>
         <w:tc>
           <w:tcPr>
-            <w:tcW w:type="dxa" w:w="3312"/>
+            <w:tcW w:type="dxa" w:w="3360"/>
             <w:vAlign w:val="center"/>
           </w:tcPr>
           <w:p>
@@ -736,7 +565,7 @@
       <w:tr>
         <w:tc>
           <w:tcPr>
-            <w:tcW w:type="dxa" w:w="3312"/>
+            <w:tcW w:type="dxa" w:w="3360"/>
             <w:vAlign w:val="center"/>
           </w:tcPr>
           <w:p>
@@ -753,7 +582,7 @@
         </w:tc>
         <w:tc>
           <w:tcPr>
-            <w:tcW w:type="dxa" w:w="3312"/>
+            <w:tcW w:type="dxa" w:w="3360"/>
             <w:vAlign w:val="center"/>
           </w:tcPr>
           <w:p>
@@ -770,7 +599,7 @@
         </w:tc>
         <w:tc>
           <w:tcPr>
-            <w:tcW w:type="dxa" w:w="3312"/>
+            <w:tcW w:type="dxa" w:w="3360"/>
             <w:vAlign w:val="center"/>
           </w:tcPr>
           <w:p>
@@ -789,7 +618,7 @@
       <w:tr>
         <w:tc>
           <w:tcPr>
-            <w:tcW w:type="dxa" w:w="3312"/>
+            <w:tcW w:type="dxa" w:w="3360"/>
             <w:vAlign w:val="center"/>
             <w:shd w:fill="EAF4EA"/>
           </w:tcPr>
@@ -807,7 +636,7 @@
         </w:tc>
         <w:tc>
           <w:tcPr>
-            <w:tcW w:type="dxa" w:w="3312"/>
+            <w:tcW w:type="dxa" w:w="3360"/>
             <w:vAlign w:val="center"/>
             <w:shd w:fill="EAF4EA"/>
           </w:tcPr>
@@ -825,7 +654,7 @@
         </w:tc>
         <w:tc>
           <w:tcPr>
-            <w:tcW w:type="dxa" w:w="3312"/>
+            <w:tcW w:type="dxa" w:w="3360"/>
             <w:vAlign w:val="center"/>
             <w:shd w:fill="EAF4EA"/>
           </w:tcPr>
@@ -845,7 +674,11 @@
     </w:tbl>
     <w:p>
       <w:r>
-        <w:t>As estimativas acima são em dias de trabalho, considerando uma rotina de 9 horas por dia e 5 dias por semana.</w:t>
+        <w:rPr>
+          <w:b w:val="0"/>
+          <w:i w:val="0"/>
+        </w:rPr>
+        <w:t>As estimativas são em dias de trabalho, considerando uma rotina de 9 horas por dia e 5 dias por semana. Os prazos podem variar conforme ajustes, integrações, relatórios, catraca/cartões, formas de pagamento e validações durante o uso.</w:t>
       </w:r>
     </w:p>
     <w:p>
@@ -853,170 +686,1738 @@
         <w:pStyle w:val="Heading1"/>
       </w:pPr>
       <w:r>
-        <w:t>9. Por que dividir em etapas</w:t>
-      </w:r>
-    </w:p>
-    <w:p>
-      <w:pPr>
-        <w:pStyle w:val="ListBullet"/>
-      </w:pPr>
-      <w:r>
-        <w:t>Começar pelo que e mais importante.</w:t>
-      </w:r>
-    </w:p>
-    <w:p>
-      <w:pPr>
-        <w:pStyle w:val="ListBullet"/>
-      </w:pPr>
-      <w:r>
-        <w:t>Evitar criar tudo de uma vez sem validar.</w:t>
-      </w:r>
-    </w:p>
-    <w:p>
-      <w:pPr>
-        <w:pStyle w:val="ListBullet"/>
-      </w:pPr>
-      <w:r>
-        <w:t>Reduzir risco.</w:t>
-      </w:r>
-    </w:p>
-    <w:p>
-      <w:pPr>
-        <w:pStyle w:val="ListBullet"/>
-      </w:pPr>
-      <w:r>
-        <w:t>Permitir que o ginásio comece a usar o sistema mais cedo.</w:t>
-      </w:r>
-    </w:p>
-    <w:p>
-      <w:pPr>
-        <w:pStyle w:val="ListBullet"/>
-      </w:pPr>
-      <w:r>
-        <w:t>Melhorar o sistema com base no uso real.</w:t>
-      </w:r>
-    </w:p>
-    <w:p>
-      <w:pPr>
-        <w:pStyle w:val="ListBullet"/>
-      </w:pPr>
-      <w:r>
-        <w:t>Deixar as funções mais avançadas para depois da base estar estável.</w:t>
-      </w:r>
-    </w:p>
-    <w:p>
-      <w:pPr>
-        <w:pStyle w:val="Heading1"/>
-      </w:pPr>
-      <w:r>
-        <w:t>10. Resultado esperado da primeira etapa</w:t>
-      </w:r>
-    </w:p>
-    <w:p>
-      <w:r>
-        <w:t>No final da primeira etapa, o ginásio já deverá conseguir cadastrar clientes, controlar planos e contratos, receber pagamentos, controlar caixa, vender produtos e serviços, registar entradas, acompanhar avaliações físicas, saber quem está ativo ou vencido e guardar backup na nuvem.</w:t>
-      </w:r>
-    </w:p>
-    <w:p>
-      <w:r>
-        <w:t>Ou seja, a primeira etapa já entrega uma ferramenta util para a operação diaria do ginásio.</w:t>
-      </w:r>
-    </w:p>
-    <w:p>
-      <w:pPr>
-        <w:pStyle w:val="Heading1"/>
-      </w:pPr>
-      <w:r>
-        <w:t>11. Observações importantes</w:t>
-      </w:r>
-    </w:p>
-    <w:p>
-      <w:pPr>
-        <w:pStyle w:val="ListBullet"/>
-      </w:pPr>
-      <w:r>
-        <w:t>O prazo pode variar conforme a quantidade de telas desejadas.</w:t>
-      </w:r>
-    </w:p>
-    <w:p>
-      <w:pPr>
-        <w:pStyle w:val="ListBullet"/>
-      </w:pPr>
-      <w:r>
-        <w:t>Relatórios, regras específicas de caixa e recibos podem alterár o esforco.</w:t>
-      </w:r>
-    </w:p>
-    <w:p>
-      <w:pPr>
-        <w:pStyle w:val="ListBullet"/>
-      </w:pPr>
-      <w:r>
-        <w:t>O tipo de cartão/tag ou catraca usado pode influenciar a implementacao.</w:t>
-      </w:r>
-    </w:p>
-    <w:p>
-      <w:pPr>
-        <w:pStyle w:val="ListBullet"/>
-      </w:pPr>
-      <w:r>
-        <w:t>O modelo de backup na nuvem precisa ser definido.</w:t>
-      </w:r>
-    </w:p>
-    <w:p>
-      <w:pPr>
-        <w:pStyle w:val="ListBullet"/>
-      </w:pPr>
-      <w:r>
-        <w:t>Pagamentos pelo aplicativo dependem do meio de pagamento escolhido.</w:t>
-      </w:r>
-    </w:p>
-    <w:p>
-      <w:pPr>
-        <w:pStyle w:val="ListBullet"/>
-      </w:pPr>
-      <w:r>
-        <w:t>Importação de dados antigos e ajustes solicitados durante a validação podem impactar o prazo.</w:t>
-      </w:r>
-    </w:p>
-    <w:p>
-      <w:pPr>
-        <w:pStyle w:val="Heading1"/>
-      </w:pPr>
-      <w:r>
-        <w:t>12. Conclusão</w:t>
-      </w:r>
-    </w:p>
-    <w:p>
-      <w:r>
-        <w:t>Este sistema será uma solução completa para profissionalizar a gestão do ginásio, melhorar o controlo financeiro, organizar o atendimento, acompanhar os clientes e preparar o negócio para crescer.</w:t>
-      </w:r>
-    </w:p>
-    <w:p>
-      <w:r>
-        <w:t>A recomendação é iniciar pela primeira etapa, com o sistema base para uso interno, e depois evoluir para painel web, CRM, SMS e aplicativo mobile.</w:t>
-      </w:r>
-    </w:p>
-    <w:p>
-      <w:pPr>
-        <w:pStyle w:val="Heading1"/>
-      </w:pPr>
-      <w:r>
-        <w:t>Resumo simples para o cliente</w:t>
+        <w:t>4. Etapa 1 - Sistema desktop base</w:t>
       </w:r>
     </w:p>
     <w:p>
       <w:r>
         <w:rPr>
-          <w:rFonts w:ascii="Aptos" w:hAnsi="Aptos"/>
-          <w:color w:val="28313B"/>
-          <w:sz w:val="21"/>
+          <w:b w:val="0"/>
+          <w:i w:val="0"/>
         </w:rPr>
-        <w:t>A primeira entrega pode ficar entre 25 e 40 dias de trabalho. O sistema completo, nas três etapas, pode ficar entre 70 e 110 dias de trabalho, considerando 9 horas por dia e 5 dias por semana.</w:t>
+        <w:t>Objetivo da etapa: entregar à DP Gym uma primeira versão funcional do sistema para uso interno no ginásio, principalmente na recepção, administração e caixa.</w:t>
+      </w:r>
+    </w:p>
+    <w:p>
+      <w:r>
+        <w:rPr>
+          <w:b w:val="0"/>
+          <w:i w:val="0"/>
+        </w:rPr>
+        <w:t>Nesta fase, o sistema não incluirá ainda CRM, painel web, integração entre ginásios ou aplicativo mobile. O foco será organizar a operação principal do ginásio.</w:t>
+      </w:r>
+    </w:p>
+    <w:p>
+      <w:pPr>
+        <w:pStyle w:val="Heading3"/>
+      </w:pPr>
+      <w:r>
+        <w:t>4.1 Usuários, perfis e permissões</w:t>
+      </w:r>
+    </w:p>
+    <w:p>
+      <w:pPr>
+        <w:pStyle w:val="ListBullet"/>
+      </w:pPr>
+      <w:r>
+        <w:t>cadastro de usuários do sistema;</w:t>
+      </w:r>
+    </w:p>
+    <w:p>
+      <w:pPr>
+        <w:pStyle w:val="ListBullet"/>
+      </w:pPr>
+      <w:r>
+        <w:t>criação de perfis como gestor, recepcionista, caixa, treinador e administrador;</w:t>
+      </w:r>
+    </w:p>
+    <w:p>
+      <w:pPr>
+        <w:pStyle w:val="ListBullet"/>
+      </w:pPr>
+      <w:r>
+        <w:t>definição de permissões por perfil;</w:t>
+      </w:r>
+    </w:p>
+    <w:p>
+      <w:pPr>
+        <w:pStyle w:val="ListBullet"/>
+      </w:pPr>
+      <w:r>
+        <w:t>controlo de quem pode ver, criar, editar ou eliminar informações;</w:t>
+      </w:r>
+    </w:p>
+    <w:p>
+      <w:pPr>
+        <w:pStyle w:val="ListBullet"/>
+      </w:pPr>
+      <w:r>
+        <w:t>maior segurança no acesso aos dados do ginásio.</w:t>
+      </w:r>
+    </w:p>
+    <w:p>
+      <w:pPr>
+        <w:pStyle w:val="Heading3"/>
+      </w:pPr>
+      <w:r>
+        <w:t>4.2 Configurações gerais</w:t>
+      </w:r>
+    </w:p>
+    <w:p>
+      <w:pPr>
+        <w:pStyle w:val="ListBullet"/>
+      </w:pPr>
+      <w:r>
+        <w:t>dados básicos da DP Gym;</w:t>
+      </w:r>
+    </w:p>
+    <w:p>
+      <w:pPr>
+        <w:pStyle w:val="ListBullet"/>
+      </w:pPr>
+      <w:r>
+        <w:t>configurações de funcionamento;</w:t>
+      </w:r>
+    </w:p>
+    <w:p>
+      <w:pPr>
+        <w:pStyle w:val="ListBullet"/>
+      </w:pPr>
+      <w:r>
+        <w:t>tipos de pagamento;</w:t>
+      </w:r>
+    </w:p>
+    <w:p>
+      <w:pPr>
+        <w:pStyle w:val="ListBullet"/>
+      </w:pPr>
+      <w:r>
+        <w:t>regras básicas de acesso;</w:t>
+      </w:r>
+    </w:p>
+    <w:p>
+      <w:pPr>
+        <w:pStyle w:val="ListBullet"/>
+      </w:pPr>
+      <w:r>
+        <w:t>configurações de backup;</w:t>
+      </w:r>
+    </w:p>
+    <w:p>
+      <w:pPr>
+        <w:pStyle w:val="ListBullet"/>
+      </w:pPr>
+      <w:r>
+        <w:t>parâmetros usados pelo sistema no dia a dia.</w:t>
+      </w:r>
+    </w:p>
+    <w:p>
+      <w:pPr>
+        <w:pStyle w:val="Heading3"/>
+      </w:pPr>
+      <w:r>
+        <w:t>4.3 Gestão de utentes</w:t>
+      </w:r>
+    </w:p>
+    <w:p>
+      <w:pPr>
+        <w:pStyle w:val="ListBullet"/>
+      </w:pPr>
+      <w:r>
+        <w:t>cadastro completo de utentes;</w:t>
+      </w:r>
+    </w:p>
+    <w:p>
+      <w:pPr>
+        <w:pStyle w:val="ListBullet"/>
+      </w:pPr>
+      <w:r>
+        <w:t>dados pessoais e contactos;</w:t>
+      </w:r>
+    </w:p>
+    <w:p>
+      <w:pPr>
+        <w:pStyle w:val="ListBullet"/>
+      </w:pPr>
+      <w:r>
+        <w:t>fotografia do utente, se necessário;</w:t>
+      </w:r>
+    </w:p>
+    <w:p>
+      <w:pPr>
+        <w:pStyle w:val="ListBullet"/>
+      </w:pPr>
+      <w:r>
+        <w:t>estado do utente: ativo, inativo, suspenso ou bloqueado;</w:t>
+      </w:r>
+    </w:p>
+    <w:p>
+      <w:pPr>
+        <w:pStyle w:val="ListBullet"/>
+      </w:pPr>
+      <w:r>
+        <w:t>histórico de contratos;</w:t>
+      </w:r>
+    </w:p>
+    <w:p>
+      <w:pPr>
+        <w:pStyle w:val="ListBullet"/>
+      </w:pPr>
+      <w:r>
+        <w:t>histórico de pagamentos;</w:t>
+      </w:r>
+    </w:p>
+    <w:p>
+      <w:pPr>
+        <w:pStyle w:val="ListBullet"/>
+      </w:pPr>
+      <w:r>
+        <w:t>histórico de acessos;</w:t>
+      </w:r>
+    </w:p>
+    <w:p>
+      <w:pPr>
+        <w:pStyle w:val="ListBullet"/>
+      </w:pPr>
+      <w:r>
+        <w:t>observações internas.</w:t>
+      </w:r>
+    </w:p>
+    <w:p>
+      <w:pPr>
+        <w:pStyle w:val="Heading3"/>
+      </w:pPr>
+      <w:r>
+        <w:t>4.4 Pacotes e subscrições</w:t>
+      </w:r>
+    </w:p>
+    <w:p>
+      <w:pPr>
+        <w:pStyle w:val="ListBullet"/>
+      </w:pPr>
+      <w:r>
+        <w:t>criação de pacotes diários;</w:t>
+      </w:r>
+    </w:p>
+    <w:p>
+      <w:pPr>
+        <w:pStyle w:val="ListBullet"/>
+      </w:pPr>
+      <w:r>
+        <w:t>criação de pacotes semanais;</w:t>
+      </w:r>
+    </w:p>
+    <w:p>
+      <w:pPr>
+        <w:pStyle w:val="ListBullet"/>
+      </w:pPr>
+      <w:r>
+        <w:t>criação de pacotes quinzenais;</w:t>
+      </w:r>
+    </w:p>
+    <w:p>
+      <w:pPr>
+        <w:pStyle w:val="ListBullet"/>
+      </w:pPr>
+      <w:r>
+        <w:t>criação de pacotes mensais;</w:t>
+      </w:r>
+    </w:p>
+    <w:p>
+      <w:pPr>
+        <w:pStyle w:val="ListBullet"/>
+      </w:pPr>
+      <w:r>
+        <w:t>criação de pacotes anuais;</w:t>
+      </w:r>
+    </w:p>
+    <w:p>
+      <w:pPr>
+        <w:pStyle w:val="ListBullet"/>
+      </w:pPr>
+      <w:r>
+        <w:t>criação de pacotes avulsos;</w:t>
+      </w:r>
+    </w:p>
+    <w:p>
+      <w:pPr>
+        <w:pStyle w:val="ListBullet"/>
+      </w:pPr>
+      <w:r>
+        <w:t>definição de preços e duração;</w:t>
+      </w:r>
+    </w:p>
+    <w:p>
+      <w:pPr>
+        <w:pStyle w:val="ListBullet"/>
+      </w:pPr>
+      <w:r>
+        <w:t>ativação ou desativação de pacotes.</w:t>
+      </w:r>
+    </w:p>
+    <w:p>
+      <w:pPr>
+        <w:pStyle w:val="Heading3"/>
+      </w:pPr>
+      <w:r>
+        <w:t>4.5 Contratos dos utentes</w:t>
+      </w:r>
+    </w:p>
+    <w:p>
+      <w:pPr>
+        <w:pStyle w:val="ListBullet"/>
+      </w:pPr>
+      <w:r>
+        <w:t>criação de contrato para cada utente;</w:t>
+      </w:r>
+    </w:p>
+    <w:p>
+      <w:pPr>
+        <w:pStyle w:val="ListBullet"/>
+      </w:pPr>
+      <w:r>
+        <w:t>ligação do contrato ao pacote escolhido;</w:t>
+      </w:r>
+    </w:p>
+    <w:p>
+      <w:pPr>
+        <w:pStyle w:val="ListBullet"/>
+      </w:pPr>
+      <w:r>
+        <w:t>data de início e data de fim;</w:t>
+      </w:r>
+    </w:p>
+    <w:p>
+      <w:pPr>
+        <w:pStyle w:val="ListBullet"/>
+      </w:pPr>
+      <w:r>
+        <w:t>estado do contrato: ativo, vencido, suspenso ou cancelado;</w:t>
+      </w:r>
+    </w:p>
+    <w:p>
+      <w:pPr>
+        <w:pStyle w:val="ListBullet"/>
+      </w:pPr>
+      <w:r>
+        <w:t>histórico de renovações;</w:t>
+      </w:r>
+    </w:p>
+    <w:p>
+      <w:pPr>
+        <w:pStyle w:val="ListBullet"/>
+      </w:pPr>
+      <w:r>
+        <w:t>possibilidade de reativação de contrato;</w:t>
+      </w:r>
+    </w:p>
+    <w:p>
+      <w:pPr>
+        <w:pStyle w:val="ListBullet"/>
+      </w:pPr>
+      <w:r>
+        <w:t>consulta rápida da situação do utente.</w:t>
+      </w:r>
+    </w:p>
+    <w:p>
+      <w:pPr>
+        <w:pStyle w:val="Heading3"/>
+      </w:pPr>
+      <w:r>
+        <w:t>4.6 Pagamentos</w:t>
+      </w:r>
+    </w:p>
+    <w:p>
+      <w:pPr>
+        <w:pStyle w:val="ListBullet"/>
+      </w:pPr>
+      <w:r>
+        <w:t>registo de pagamentos de mensalidades;</w:t>
+      </w:r>
+    </w:p>
+    <w:p>
+      <w:pPr>
+        <w:pStyle w:val="ListBullet"/>
+      </w:pPr>
+      <w:r>
+        <w:t>registo de pagamentos anuais;</w:t>
+      </w:r>
+    </w:p>
+    <w:p>
+      <w:pPr>
+        <w:pStyle w:val="ListBullet"/>
+      </w:pPr>
+      <w:r>
+        <w:t>registo de pagamentos avulsos;</w:t>
+      </w:r>
+    </w:p>
+    <w:p>
+      <w:pPr>
+        <w:pStyle w:val="ListBullet"/>
+      </w:pPr>
+      <w:r>
+        <w:t>pagamentos de reativação de contrato;</w:t>
+      </w:r>
+    </w:p>
+    <w:p>
+      <w:pPr>
+        <w:pStyle w:val="ListBullet"/>
+      </w:pPr>
+      <w:r>
+        <w:t>histórico de pagamentos por utente;</w:t>
+      </w:r>
+    </w:p>
+    <w:p>
+      <w:pPr>
+        <w:pStyle w:val="ListBullet"/>
+      </w:pPr>
+      <w:r>
+        <w:t>identificação de pagamentos pendentes;</w:t>
+      </w:r>
+    </w:p>
+    <w:p>
+      <w:pPr>
+        <w:pStyle w:val="ListBullet"/>
+      </w:pPr>
+      <w:r>
+        <w:t>apoio à emissão de comprovativos/recibos, se definido.</w:t>
+      </w:r>
+    </w:p>
+    <w:p>
+      <w:pPr>
+        <w:pStyle w:val="Heading3"/>
+      </w:pPr>
+      <w:r>
+        <w:t>4.7 Caixa</w:t>
+      </w:r>
+    </w:p>
+    <w:p>
+      <w:pPr>
+        <w:pStyle w:val="ListBullet"/>
+      </w:pPr>
+      <w:r>
+        <w:t>abertura e fecho de caixa;</w:t>
+      </w:r>
+    </w:p>
+    <w:p>
+      <w:pPr>
+        <w:pStyle w:val="ListBullet"/>
+      </w:pPr>
+      <w:r>
+        <w:t>entradas de dinheiro;</w:t>
+      </w:r>
+    </w:p>
+    <w:p>
+      <w:pPr>
+        <w:pStyle w:val="ListBullet"/>
+      </w:pPr>
+      <w:r>
+        <w:t>saídas ou ajustes de caixa;</w:t>
+      </w:r>
+    </w:p>
+    <w:p>
+      <w:pPr>
+        <w:pStyle w:val="ListBullet"/>
+      </w:pPr>
+      <w:r>
+        <w:t>pagamentos de contratos;</w:t>
+      </w:r>
+    </w:p>
+    <w:p>
+      <w:pPr>
+        <w:pStyle w:val="ListBullet"/>
+      </w:pPr>
+      <w:r>
+        <w:t>pagamentos de produtos;</w:t>
+      </w:r>
+    </w:p>
+    <w:p>
+      <w:pPr>
+        <w:pStyle w:val="ListBullet"/>
+      </w:pPr>
+      <w:r>
+        <w:t>pagamentos de serviços;</w:t>
+      </w:r>
+    </w:p>
+    <w:p>
+      <w:pPr>
+        <w:pStyle w:val="ListBullet"/>
+      </w:pPr>
+      <w:r>
+        <w:t>formas de pagamento como dinheiro, cartão, transferência ou outro método;</w:t>
+      </w:r>
+    </w:p>
+    <w:p>
+      <w:pPr>
+        <w:pStyle w:val="ListBullet"/>
+      </w:pPr>
+      <w:r>
+        <w:t>resumo diário do caixa.</w:t>
+      </w:r>
+    </w:p>
+    <w:p>
+      <w:pPr>
+        <w:pStyle w:val="Heading3"/>
+      </w:pPr>
+      <w:r>
+        <w:t>4.8 Produtos e serviços</w:t>
+      </w:r>
+    </w:p>
+    <w:p>
+      <w:pPr>
+        <w:pStyle w:val="ListBullet"/>
+      </w:pPr>
+      <w:r>
+        <w:t>cadastro de produtos vendidos pela DP Gym;</w:t>
+      </w:r>
+    </w:p>
+    <w:p>
+      <w:pPr>
+        <w:pStyle w:val="ListBullet"/>
+      </w:pPr>
+      <w:r>
+        <w:t>cadastro de serviços extras;</w:t>
+      </w:r>
+    </w:p>
+    <w:p>
+      <w:pPr>
+        <w:pStyle w:val="ListBullet"/>
+      </w:pPr>
+      <w:r>
+        <w:t>definição de preços;</w:t>
+      </w:r>
+    </w:p>
+    <w:p>
+      <w:pPr>
+        <w:pStyle w:val="ListBullet"/>
+      </w:pPr>
+      <w:r>
+        <w:t>indicação se o item controla estoque;</w:t>
+      </w:r>
+    </w:p>
+    <w:p>
+      <w:pPr>
+        <w:pStyle w:val="ListBullet"/>
+      </w:pPr>
+      <w:r>
+        <w:t>venda de suplementos, água, acessórios, aulas extras ou outros serviços;</w:t>
+      </w:r>
+    </w:p>
+    <w:p>
+      <w:pPr>
+        <w:pStyle w:val="ListBullet"/>
+      </w:pPr>
+      <w:r>
+        <w:t>histórico de vendas.</w:t>
+      </w:r>
+    </w:p>
+    <w:p>
+      <w:pPr>
+        <w:pStyle w:val="Heading3"/>
+      </w:pPr>
+      <w:r>
+        <w:t>4.9 Movimentos de produtos e serviços</w:t>
+      </w:r>
+    </w:p>
+    <w:p>
+      <w:pPr>
+        <w:pStyle w:val="ListBullet"/>
+      </w:pPr>
+      <w:r>
+        <w:t>entrada de produtos;</w:t>
+      </w:r>
+    </w:p>
+    <w:p>
+      <w:pPr>
+        <w:pStyle w:val="ListBullet"/>
+      </w:pPr>
+      <w:r>
+        <w:t>saída de produtos;</w:t>
+      </w:r>
+    </w:p>
+    <w:p>
+      <w:pPr>
+        <w:pStyle w:val="ListBullet"/>
+      </w:pPr>
+      <w:r>
+        <w:t>venda de produtos;</w:t>
+      </w:r>
+    </w:p>
+    <w:p>
+      <w:pPr>
+        <w:pStyle w:val="ListBullet"/>
+      </w:pPr>
+      <w:r>
+        <w:t>ajustes de estoque;</w:t>
+      </w:r>
+    </w:p>
+    <w:p>
+      <w:pPr>
+        <w:pStyle w:val="ListBullet"/>
+      </w:pPr>
+      <w:r>
+        <w:t>perdas ou devoluções;</w:t>
+      </w:r>
+    </w:p>
+    <w:p>
+      <w:pPr>
+        <w:pStyle w:val="ListBullet"/>
+      </w:pPr>
+      <w:r>
+        <w:t>histórico de movimentos;</w:t>
+      </w:r>
+    </w:p>
+    <w:p>
+      <w:pPr>
+        <w:pStyle w:val="ListBullet"/>
+      </w:pPr>
+      <w:r>
+        <w:t>melhor controlo da loja interna do ginásio.</w:t>
+      </w:r>
+    </w:p>
+    <w:p>
+      <w:pPr>
+        <w:pStyle w:val="Heading3"/>
+      </w:pPr>
+      <w:r>
+        <w:t>4.10 Cartões/tags de acesso</w:t>
+      </w:r>
+    </w:p>
+    <w:p>
+      <w:pPr>
+        <w:pStyle w:val="ListBullet"/>
+      </w:pPr>
+      <w:r>
+        <w:t>cadastro de cartões ou tags;</w:t>
+      </w:r>
+    </w:p>
+    <w:p>
+      <w:pPr>
+        <w:pStyle w:val="ListBullet"/>
+      </w:pPr>
+      <w:r>
+        <w:t>associação de cartão/tag a utentes;</w:t>
+      </w:r>
+    </w:p>
+    <w:p>
+      <w:pPr>
+        <w:pStyle w:val="ListBullet"/>
+      </w:pPr>
+      <w:r>
+        <w:t>associação de cartão/tag a colaboradores;</w:t>
+      </w:r>
+    </w:p>
+    <w:p>
+      <w:pPr>
+        <w:pStyle w:val="ListBullet"/>
+      </w:pPr>
+      <w:r>
+        <w:t>bloqueio de cartão perdido ou inválido;</w:t>
+      </w:r>
+    </w:p>
+    <w:p>
+      <w:pPr>
+        <w:pStyle w:val="ListBullet"/>
+      </w:pPr>
+      <w:r>
+        <w:t>histórico de utilização.</w:t>
+      </w:r>
+    </w:p>
+    <w:p>
+      <w:pPr>
+        <w:pStyle w:val="Heading3"/>
+      </w:pPr>
+      <w:r>
+        <w:t>4.11 Controlo de acessos</w:t>
+      </w:r>
+    </w:p>
+    <w:p>
+      <w:pPr>
+        <w:pStyle w:val="ListBullet"/>
+      </w:pPr>
+      <w:r>
+        <w:t>registo de entrada de utentes;</w:t>
+      </w:r>
+    </w:p>
+    <w:p>
+      <w:pPr>
+        <w:pStyle w:val="ListBullet"/>
+      </w:pPr>
+      <w:r>
+        <w:t>registo de entrada de colaboradores;</w:t>
+      </w:r>
+    </w:p>
+    <w:p>
+      <w:pPr>
+        <w:pStyle w:val="ListBullet"/>
+      </w:pPr>
+      <w:r>
+        <w:t>validação do contrato antes da entrada;</w:t>
+      </w:r>
+    </w:p>
+    <w:p>
+      <w:pPr>
+        <w:pStyle w:val="ListBullet"/>
+      </w:pPr>
+      <w:r>
+        <w:t>bloqueio por contrato vencido;</w:t>
+      </w:r>
+    </w:p>
+    <w:p>
+      <w:pPr>
+        <w:pStyle w:val="ListBullet"/>
+      </w:pPr>
+      <w:r>
+        <w:t>bloqueio por pagamento pendente;</w:t>
+      </w:r>
+    </w:p>
+    <w:p>
+      <w:pPr>
+        <w:pStyle w:val="ListBullet"/>
+      </w:pPr>
+      <w:r>
+        <w:t>registo de tentativas autorizadas ou recusadas;</w:t>
+      </w:r>
+    </w:p>
+    <w:p>
+      <w:pPr>
+        <w:pStyle w:val="ListBullet"/>
+      </w:pPr>
+      <w:r>
+        <w:t>histórico de frequência.</w:t>
+      </w:r>
+    </w:p>
+    <w:p>
+      <w:pPr>
+        <w:pStyle w:val="Heading3"/>
+      </w:pPr>
+      <w:r>
+        <w:t>4.12 Avaliações físicas/check-ups</w:t>
+      </w:r>
+    </w:p>
+    <w:p>
+      <w:pPr>
+        <w:pStyle w:val="ListBullet"/>
+      </w:pPr>
+      <w:r>
+        <w:t>registo de avaliação física do utente;</w:t>
+      </w:r>
+    </w:p>
+    <w:p>
+      <w:pPr>
+        <w:pStyle w:val="ListBullet"/>
+      </w:pPr>
+      <w:r>
+        <w:t>peso, medidas e observações;</w:t>
+      </w:r>
+    </w:p>
+    <w:p>
+      <w:pPr>
+        <w:pStyle w:val="ListBullet"/>
+      </w:pPr>
+      <w:r>
+        <w:t>objetivos do utente;</w:t>
+      </w:r>
+    </w:p>
+    <w:p>
+      <w:pPr>
+        <w:pStyle w:val="ListBullet"/>
+      </w:pPr>
+      <w:r>
+        <w:t>treinador responsável;</w:t>
+      </w:r>
+    </w:p>
+    <w:p>
+      <w:pPr>
+        <w:pStyle w:val="ListBullet"/>
+      </w:pPr>
+      <w:r>
+        <w:t>data da próxima avaliação;</w:t>
+      </w:r>
+    </w:p>
+    <w:p>
+      <w:pPr>
+        <w:pStyle w:val="ListBullet"/>
+      </w:pPr>
+      <w:r>
+        <w:t>histórico da evolução do utente.</w:t>
+      </w:r>
+    </w:p>
+    <w:p>
+      <w:pPr>
+        <w:pStyle w:val="Heading3"/>
+      </w:pPr>
+      <w:r>
+        <w:t>4.13 Relatórios básicos</w:t>
+      </w:r>
+    </w:p>
+    <w:p>
+      <w:pPr>
+        <w:pStyle w:val="ListBullet"/>
+      </w:pPr>
+      <w:r>
+        <w:t>utentes ativos;</w:t>
+      </w:r>
+    </w:p>
+    <w:p>
+      <w:pPr>
+        <w:pStyle w:val="ListBullet"/>
+      </w:pPr>
+      <w:r>
+        <w:t>utentes inativos;</w:t>
+      </w:r>
+    </w:p>
+    <w:p>
+      <w:pPr>
+        <w:pStyle w:val="ListBullet"/>
+      </w:pPr>
+      <w:r>
+        <w:t>contratos vencidos;</w:t>
+      </w:r>
+    </w:p>
+    <w:p>
+      <w:pPr>
+        <w:pStyle w:val="ListBullet"/>
+      </w:pPr>
+      <w:r>
+        <w:t>pagamentos recebidos;</w:t>
+      </w:r>
+    </w:p>
+    <w:p>
+      <w:pPr>
+        <w:pStyle w:val="ListBullet"/>
+      </w:pPr>
+      <w:r>
+        <w:t>resumo de caixa;</w:t>
+      </w:r>
+    </w:p>
+    <w:p>
+      <w:pPr>
+        <w:pStyle w:val="ListBullet"/>
+      </w:pPr>
+      <w:r>
+        <w:t>vendas de produtos e serviços;</w:t>
+      </w:r>
+    </w:p>
+    <w:p>
+      <w:pPr>
+        <w:pStyle w:val="ListBullet"/>
+      </w:pPr>
+      <w:r>
+        <w:t>acessos por período;</w:t>
+      </w:r>
+    </w:p>
+    <w:p>
+      <w:pPr>
+        <w:pStyle w:val="ListBullet"/>
+      </w:pPr>
+      <w:r>
+        <w:t>avaliações realizadas.</w:t>
+      </w:r>
+    </w:p>
+    <w:p>
+      <w:pPr>
+        <w:pStyle w:val="Heading3"/>
+      </w:pPr>
+      <w:r>
+        <w:t>4.14 Backup na nuvem</w:t>
+      </w:r>
+    </w:p>
+    <w:p>
+      <w:pPr>
+        <w:pStyle w:val="ListBullet"/>
+      </w:pPr>
+      <w:r>
+        <w:t>cópia de segurança dos dados;</w:t>
+      </w:r>
+    </w:p>
+    <w:p>
+      <w:pPr>
+        <w:pStyle w:val="ListBullet"/>
+      </w:pPr>
+      <w:r>
+        <w:t>maior proteção contra perda de informação;</w:t>
+      </w:r>
+    </w:p>
+    <w:p>
+      <w:pPr>
+        <w:pStyle w:val="ListBullet"/>
+      </w:pPr>
+      <w:r>
+        <w:t>possibilidade de restauração conforme política definida;</w:t>
+      </w:r>
+    </w:p>
+    <w:p>
+      <w:pPr>
+        <w:pStyle w:val="ListBullet"/>
+      </w:pPr>
+      <w:r>
+        <w:t>segurança adicional para a operação da DP Gym.</w:t>
+      </w:r>
+    </w:p>
+    <w:p>
+      <w:pPr>
+        <w:pStyle w:val="Heading3"/>
+      </w:pPr>
+      <w:r>
+        <w:t>O que não entra na Etapa 1</w:t>
+      </w:r>
+    </w:p>
+    <w:p>
+      <w:pPr>
+        <w:pStyle w:val="ListBullet"/>
+      </w:pPr>
+      <w:r>
+        <w:t>CRM;</w:t>
+      </w:r>
+    </w:p>
+    <w:p>
+      <w:pPr>
+        <w:pStyle w:val="ListBullet"/>
+      </w:pPr>
+      <w:r>
+        <w:t>envio automático de SMS;</w:t>
+      </w:r>
+    </w:p>
+    <w:p>
+      <w:pPr>
+        <w:pStyle w:val="ListBullet"/>
+      </w:pPr>
+      <w:r>
+        <w:t>painel web;</w:t>
+      </w:r>
+    </w:p>
+    <w:p>
+      <w:pPr>
+        <w:pStyle w:val="ListBullet"/>
+      </w:pPr>
+      <w:r>
+        <w:t>Web API;</w:t>
+      </w:r>
+    </w:p>
+    <w:p>
+      <w:pPr>
+        <w:pStyle w:val="ListBullet"/>
+      </w:pPr>
+      <w:r>
+        <w:t>aplicativo mobile;</w:t>
+      </w:r>
+    </w:p>
+    <w:p>
+      <w:pPr>
+        <w:pStyle w:val="ListBullet"/>
+      </w:pPr>
+      <w:r>
+        <w:t>integração entre vários ginásios;</w:t>
+      </w:r>
+    </w:p>
+    <w:p>
+      <w:pPr>
+        <w:pStyle w:val="ListBullet"/>
+      </w:pPr>
+      <w:r>
+        <w:t>pagamentos pelo aplicativo mobile.</w:t>
+      </w:r>
+    </w:p>
+    <w:p>
+      <w:r>
+        <w:rPr>
+          <w:b/>
+          <w:i w:val="0"/>
+        </w:rPr>
+        <w:t>Estimativa da Etapa 1: 25 a 40 dias de trabalho.</w:t>
+      </w:r>
+    </w:p>
+    <w:p>
+      <w:pPr>
+        <w:pStyle w:val="Heading1"/>
+      </w:pPr>
+      <w:r>
+        <w:t>5. Etapa 2 - Painel web, Web API, CRM e SMS</w:t>
+      </w:r>
+    </w:p>
+    <w:p>
+      <w:r>
+        <w:rPr>
+          <w:b w:val="0"/>
+          <w:i w:val="0"/>
+        </w:rPr>
+        <w:t>Objetivo da etapa: permitir que a DP Gym acompanhe o avanço do ginásio remotamente e melhore o relacionamento com os utentes através de CRM, campanhas, bónus e SMS.</w:t>
+      </w:r>
+    </w:p>
+    <w:p>
+      <w:pPr>
+        <w:pStyle w:val="Heading3"/>
+      </w:pPr>
+      <w:r>
+        <w:t>5.1 Painel web para acompanhamento remoto</w:t>
+      </w:r>
+    </w:p>
+    <w:p>
+      <w:pPr>
+        <w:pStyle w:val="ListBullet"/>
+      </w:pPr>
+      <w:r>
+        <w:t>acesso do gestor pela web;</w:t>
+      </w:r>
+    </w:p>
+    <w:p>
+      <w:pPr>
+        <w:pStyle w:val="ListBullet"/>
+      </w:pPr>
+      <w:r>
+        <w:t>visão geral do ginásio;</w:t>
+      </w:r>
+    </w:p>
+    <w:p>
+      <w:pPr>
+        <w:pStyle w:val="ListBullet"/>
+      </w:pPr>
+      <w:r>
+        <w:t>acompanhamento de utentes ativos;</w:t>
+      </w:r>
+    </w:p>
+    <w:p>
+      <w:pPr>
+        <w:pStyle w:val="ListBullet"/>
+      </w:pPr>
+      <w:r>
+        <w:t>acompanhamento de contratos vencidos;</w:t>
+      </w:r>
+    </w:p>
+    <w:p>
+      <w:pPr>
+        <w:pStyle w:val="ListBullet"/>
+      </w:pPr>
+      <w:r>
+        <w:t>acompanhamento de pagamentos;</w:t>
+      </w:r>
+    </w:p>
+    <w:p>
+      <w:pPr>
+        <w:pStyle w:val="ListBullet"/>
+      </w:pPr>
+      <w:r>
+        <w:t>acompanhamento do caixa;</w:t>
+      </w:r>
+    </w:p>
+    <w:p>
+      <w:pPr>
+        <w:pStyle w:val="ListBullet"/>
+      </w:pPr>
+      <w:r>
+        <w:t>acompanhamento de vendas;</w:t>
+      </w:r>
+    </w:p>
+    <w:p>
+      <w:pPr>
+        <w:pStyle w:val="ListBullet"/>
+      </w:pPr>
+      <w:r>
+        <w:t>acompanhamento de acessos;</w:t>
+      </w:r>
+    </w:p>
+    <w:p>
+      <w:pPr>
+        <w:pStyle w:val="ListBullet"/>
+      </w:pPr>
+      <w:r>
+        <w:t>indicadores básicos de desempenho.</w:t>
+      </w:r>
+    </w:p>
+    <w:p>
+      <w:pPr>
+        <w:pStyle w:val="Heading3"/>
+      </w:pPr>
+      <w:r>
+        <w:t>5.2 Centralização dos dados</w:t>
+      </w:r>
+    </w:p>
+    <w:p>
+      <w:pPr>
+        <w:pStyle w:val="ListBullet"/>
+      </w:pPr>
+      <w:r>
+        <w:t>preparação para dados centralizados;</w:t>
+      </w:r>
+    </w:p>
+    <w:p>
+      <w:pPr>
+        <w:pStyle w:val="ListBullet"/>
+      </w:pPr>
+      <w:r>
+        <w:t>comunicação entre o sistema desktop e o servidor;</w:t>
+      </w:r>
+    </w:p>
+    <w:p>
+      <w:pPr>
+        <w:pStyle w:val="ListBullet"/>
+      </w:pPr>
+      <w:r>
+        <w:t>possibilidade de consulta remota;</w:t>
+      </w:r>
+    </w:p>
+    <w:p>
+      <w:pPr>
+        <w:pStyle w:val="ListBullet"/>
+      </w:pPr>
+      <w:r>
+        <w:t>base preparada para crescimento futuro.</w:t>
+      </w:r>
+    </w:p>
+    <w:p>
+      <w:pPr>
+        <w:pStyle w:val="Heading3"/>
+      </w:pPr>
+      <w:r>
+        <w:t>5.3 CRM</w:t>
+      </w:r>
+    </w:p>
+    <w:p>
+      <w:pPr>
+        <w:pStyle w:val="ListBullet"/>
+      </w:pPr>
+      <w:r>
+        <w:t>identificação de utentes ausentes;</w:t>
+      </w:r>
+    </w:p>
+    <w:p>
+      <w:pPr>
+        <w:pStyle w:val="ListBullet"/>
+      </w:pPr>
+      <w:r>
+        <w:t>segmentação de clientes;</w:t>
+      </w:r>
+    </w:p>
+    <w:p>
+      <w:pPr>
+        <w:pStyle w:val="ListBullet"/>
+      </w:pPr>
+      <w:r>
+        <w:t>histórico de comunicação;</w:t>
+      </w:r>
+    </w:p>
+    <w:p>
+      <w:pPr>
+        <w:pStyle w:val="ListBullet"/>
+      </w:pPr>
+      <w:r>
+        <w:t>campanhas de renovação;</w:t>
+      </w:r>
+    </w:p>
+    <w:p>
+      <w:pPr>
+        <w:pStyle w:val="ListBullet"/>
+      </w:pPr>
+      <w:r>
+        <w:t>campanhas de reativação;</w:t>
+      </w:r>
+    </w:p>
+    <w:p>
+      <w:pPr>
+        <w:pStyle w:val="ListBullet"/>
+      </w:pPr>
+      <w:r>
+        <w:t>campanhas promocionais;</w:t>
+      </w:r>
+    </w:p>
+    <w:p>
+      <w:pPr>
+        <w:pStyle w:val="ListBullet"/>
+      </w:pPr>
+      <w:r>
+        <w:t>acompanhamento de relacionamento com o utente.</w:t>
+      </w:r>
+    </w:p>
+    <w:p>
+      <w:pPr>
+        <w:pStyle w:val="Heading3"/>
+      </w:pPr>
+      <w:r>
+        <w:t>5.4 Bónus e fidelização</w:t>
+      </w:r>
+    </w:p>
+    <w:p>
+      <w:pPr>
+        <w:pStyle w:val="ListBullet"/>
+      </w:pPr>
+      <w:r>
+        <w:t>atribuição de bónus a utentes;</w:t>
+      </w:r>
+    </w:p>
+    <w:p>
+      <w:pPr>
+        <w:pStyle w:val="ListBullet"/>
+      </w:pPr>
+      <w:r>
+        <w:t>dias extra de treino;</w:t>
+      </w:r>
+    </w:p>
+    <w:p>
+      <w:pPr>
+        <w:pStyle w:val="ListBullet"/>
+      </w:pPr>
+      <w:r>
+        <w:t>descontos promocionais;</w:t>
+      </w:r>
+    </w:p>
+    <w:p>
+      <w:pPr>
+        <w:pStyle w:val="ListBullet"/>
+      </w:pPr>
+      <w:r>
+        <w:t>benefícios por fidelização;</w:t>
+      </w:r>
+    </w:p>
+    <w:p>
+      <w:pPr>
+        <w:pStyle w:val="ListBullet"/>
+      </w:pPr>
+      <w:r>
+        <w:t>campanhas para clientes que indicam amigos;</w:t>
+      </w:r>
+    </w:p>
+    <w:p>
+      <w:pPr>
+        <w:pStyle w:val="ListBullet"/>
+      </w:pPr>
+      <w:r>
+        <w:t>controlo de bónus utilizados ou pendentes.</w:t>
+      </w:r>
+    </w:p>
+    <w:p>
+      <w:pPr>
+        <w:pStyle w:val="Heading3"/>
+      </w:pPr>
+      <w:r>
+        <w:t>5.5 Envio de SMS</w:t>
+      </w:r>
+    </w:p>
+    <w:p>
+      <w:pPr>
+        <w:pStyle w:val="ListBullet"/>
+      </w:pPr>
+      <w:r>
+        <w:t>mensagem de boas-vindas;</w:t>
+      </w:r>
+    </w:p>
+    <w:p>
+      <w:pPr>
+        <w:pStyle w:val="ListBullet"/>
+      </w:pPr>
+      <w:r>
+        <w:t>aviso antes do vencimento do contrato;</w:t>
+      </w:r>
+    </w:p>
+    <w:p>
+      <w:pPr>
+        <w:pStyle w:val="ListBullet"/>
+      </w:pPr>
+      <w:r>
+        <w:t>aviso de contrato vencido;</w:t>
+      </w:r>
+    </w:p>
+    <w:p>
+      <w:pPr>
+        <w:pStyle w:val="ListBullet"/>
+      </w:pPr>
+      <w:r>
+        <w:t>mensagem para utentes ausentes;</w:t>
+      </w:r>
+    </w:p>
+    <w:p>
+      <w:pPr>
+        <w:pStyle w:val="ListBullet"/>
+      </w:pPr>
+      <w:r>
+        <w:t>lembrete de avaliação física;</w:t>
+      </w:r>
+    </w:p>
+    <w:p>
+      <w:pPr>
+        <w:pStyle w:val="ListBullet"/>
+      </w:pPr>
+      <w:r>
+        <w:t>mensagem de aniversário;</w:t>
+      </w:r>
+    </w:p>
+    <w:p>
+      <w:pPr>
+        <w:pStyle w:val="ListBullet"/>
+      </w:pPr>
+      <w:r>
+        <w:t>campanha de reativação;</w:t>
+      </w:r>
+    </w:p>
+    <w:p>
+      <w:pPr>
+        <w:pStyle w:val="ListBullet"/>
+      </w:pPr>
+      <w:r>
+        <w:t>campanhas promocionais.</w:t>
+      </w:r>
+    </w:p>
+    <w:p>
+      <w:r>
+        <w:rPr>
+          <w:b w:val="0"/>
+          <w:i w:val="0"/>
+        </w:rPr>
+        <w:t>Exemplo: se um utente ficar 15 dias sem treinar, o sistema poderá identificar essa ausência e enviar uma mensagem como: “Olá João, sentimos a sua falta na DP Gym. Volte aos treinos e continue firme no seu objetivo!”</w:t>
+      </w:r>
+    </w:p>
+    <w:p>
+      <w:r>
+        <w:rPr>
+          <w:b/>
+          <w:i w:val="0"/>
+        </w:rPr>
+        <w:t>Estimativa da Etapa 2: 25 a 40 dias de trabalho.</w:t>
+      </w:r>
+    </w:p>
+    <w:p>
+      <w:pPr>
+        <w:pStyle w:val="Heading1"/>
+      </w:pPr>
+      <w:r>
+        <w:t>6. Etapa 3 - Aplicativo mobile para os utentes</w:t>
+      </w:r>
+    </w:p>
+    <w:p>
+      <w:r>
+        <w:rPr>
+          <w:b w:val="0"/>
+          <w:i w:val="0"/>
+        </w:rPr>
+        <w:t>Objetivo da etapa: criar um aplicativo para que cada utente da DP Gym acompanhe as suas informações pelo telemóvel, reduzindo a dependência da recepção para consultas simples.</w:t>
+      </w:r>
+    </w:p>
+    <w:p>
+      <w:pPr>
+        <w:pStyle w:val="Heading3"/>
+      </w:pPr>
+      <w:r>
+        <w:t>6.1 Conta do utente</w:t>
+      </w:r>
+    </w:p>
+    <w:p>
+      <w:pPr>
+        <w:pStyle w:val="ListBullet"/>
+      </w:pPr>
+      <w:r>
+        <w:t>acesso do utente ao aplicativo;</w:t>
+      </w:r>
+    </w:p>
+    <w:p>
+      <w:pPr>
+        <w:pStyle w:val="ListBullet"/>
+      </w:pPr>
+      <w:r>
+        <w:t>visualização dos seus dados principais;</w:t>
+      </w:r>
+    </w:p>
+    <w:p>
+      <w:pPr>
+        <w:pStyle w:val="ListBullet"/>
+      </w:pPr>
+      <w:r>
+        <w:t>consulta do estado da subscrição;</w:t>
+      </w:r>
+    </w:p>
+    <w:p>
+      <w:pPr>
+        <w:pStyle w:val="ListBullet"/>
+      </w:pPr>
+      <w:r>
+        <w:t>consulta da validade do contrato.</w:t>
+      </w:r>
+    </w:p>
+    <w:p>
+      <w:pPr>
+        <w:pStyle w:val="Heading3"/>
+      </w:pPr>
+      <w:r>
+        <w:t>6.2 Histórico</w:t>
+      </w:r>
+    </w:p>
+    <w:p>
+      <w:pPr>
+        <w:pStyle w:val="ListBullet"/>
+      </w:pPr>
+      <w:r>
+        <w:t>histórico de pagamentos;</w:t>
+      </w:r>
+    </w:p>
+    <w:p>
+      <w:pPr>
+        <w:pStyle w:val="ListBullet"/>
+      </w:pPr>
+      <w:r>
+        <w:t>histórico de acessos;</w:t>
+      </w:r>
+    </w:p>
+    <w:p>
+      <w:pPr>
+        <w:pStyle w:val="ListBullet"/>
+      </w:pPr>
+      <w:r>
+        <w:t>histórico de contratos;</w:t>
+      </w:r>
+    </w:p>
+    <w:p>
+      <w:pPr>
+        <w:pStyle w:val="ListBullet"/>
+      </w:pPr>
+      <w:r>
+        <w:t>histórico de avaliações físicas;</w:t>
+      </w:r>
+    </w:p>
+    <w:p>
+      <w:pPr>
+        <w:pStyle w:val="ListBullet"/>
+      </w:pPr>
+      <w:r>
+        <w:t>acompanhamento da evolução.</w:t>
+      </w:r>
+    </w:p>
+    <w:p>
+      <w:pPr>
+        <w:pStyle w:val="Heading3"/>
+      </w:pPr>
+      <w:r>
+        <w:t>6.3 Pagamentos pelo aplicativo</w:t>
+      </w:r>
+    </w:p>
+    <w:p>
+      <w:pPr>
+        <w:pStyle w:val="ListBullet"/>
+      </w:pPr>
+      <w:r>
+        <w:t>possibilidade de pagamento pelo mobile;</w:t>
+      </w:r>
+    </w:p>
+    <w:p>
+      <w:pPr>
+        <w:pStyle w:val="ListBullet"/>
+      </w:pPr>
+      <w:r>
+        <w:t>escolha do método de pagamento, conforme provedor definido;</w:t>
+      </w:r>
+    </w:p>
+    <w:p>
+      <w:pPr>
+        <w:pStyle w:val="ListBullet"/>
+      </w:pPr>
+      <w:r>
+        <w:t>atualização do estado do contrato após confirmação;</w:t>
+      </w:r>
+    </w:p>
+    <w:p>
+      <w:pPr>
+        <w:pStyle w:val="ListBullet"/>
+      </w:pPr>
+      <w:r>
+        <w:t>consulta de pagamentos efetuados.</w:t>
+      </w:r>
+    </w:p>
+    <w:p>
+      <w:pPr>
+        <w:pStyle w:val="Heading3"/>
+      </w:pPr>
+      <w:r>
+        <w:t>6.4 Comunicação e notificações</w:t>
+      </w:r>
+    </w:p>
+    <w:p>
+      <w:pPr>
+        <w:pStyle w:val="ListBullet"/>
+      </w:pPr>
+      <w:r>
+        <w:t>notificações de vencimento;</w:t>
+      </w:r>
+    </w:p>
+    <w:p>
+      <w:pPr>
+        <w:pStyle w:val="ListBullet"/>
+      </w:pPr>
+      <w:r>
+        <w:t>notificações de campanhas;</w:t>
+      </w:r>
+    </w:p>
+    <w:p>
+      <w:pPr>
+        <w:pStyle w:val="ListBullet"/>
+      </w:pPr>
+      <w:r>
+        <w:t>notificações de bónus;</w:t>
+      </w:r>
+    </w:p>
+    <w:p>
+      <w:pPr>
+        <w:pStyle w:val="ListBullet"/>
+      </w:pPr>
+      <w:r>
+        <w:t>lembretes de avaliação física;</w:t>
+      </w:r>
+    </w:p>
+    <w:p>
+      <w:pPr>
+        <w:pStyle w:val="ListBullet"/>
+      </w:pPr>
+      <w:r>
+        <w:t>mensagens importantes da DP Gym.</w:t>
+      </w:r>
+    </w:p>
+    <w:p>
+      <w:pPr>
+        <w:pStyle w:val="Heading3"/>
+      </w:pPr>
+      <w:r>
+        <w:t>6.5 Experiência do utente</w:t>
+      </w:r>
+    </w:p>
+    <w:p>
+      <w:pPr>
+        <w:pStyle w:val="ListBullet"/>
+      </w:pPr>
+      <w:r>
+        <w:t>maior autonomia para o cliente;</w:t>
+      </w:r>
+    </w:p>
+    <w:p>
+      <w:pPr>
+        <w:pStyle w:val="ListBullet"/>
+      </w:pPr>
+      <w:r>
+        <w:t>acesso rápido a informações importantes;</w:t>
+      </w:r>
+    </w:p>
+    <w:p>
+      <w:pPr>
+        <w:pStyle w:val="ListBullet"/>
+      </w:pPr>
+      <w:r>
+        <w:t>melhor percepção de valor;</w:t>
+      </w:r>
+    </w:p>
+    <w:p>
+      <w:pPr>
+        <w:pStyle w:val="ListBullet"/>
+      </w:pPr>
+      <w:r>
+        <w:t>relacionamento mais próximo com a DP Gym.</w:t>
+      </w:r>
+    </w:p>
+    <w:p>
+      <w:r>
+        <w:rPr>
+          <w:b/>
+          <w:i w:val="0"/>
+        </w:rPr>
+        <w:t>Estimativa da Etapa 3: 20 a 30 dias de trabalho.</w:t>
+      </w:r>
+    </w:p>
+    <w:p>
+      <w:pPr>
+        <w:pStyle w:val="Heading1"/>
+      </w:pPr>
+      <w:r>
+        <w:t>7. Resultado esperado</w:t>
+      </w:r>
+    </w:p>
+    <w:p>
+      <w:r>
+        <w:rPr>
+          <w:b w:val="0"/>
+          <w:i w:val="0"/>
+        </w:rPr>
+        <w:t>Ao final das três etapas, a DP Gym terá uma plataforma completa para:</w:t>
+      </w:r>
+    </w:p>
+    <w:p>
+      <w:pPr>
+        <w:pStyle w:val="ListBullet"/>
+      </w:pPr>
+      <w:r>
+        <w:t>gerir os utentes;</w:t>
+      </w:r>
+    </w:p>
+    <w:p>
+      <w:pPr>
+        <w:pStyle w:val="ListBullet"/>
+      </w:pPr>
+      <w:r>
+        <w:t>controlar contratos e pagamentos;</w:t>
+      </w:r>
+    </w:p>
+    <w:p>
+      <w:pPr>
+        <w:pStyle w:val="ListBullet"/>
+      </w:pPr>
+      <w:r>
+        <w:t>controlar entradas;</w:t>
+      </w:r>
+    </w:p>
+    <w:p>
+      <w:pPr>
+        <w:pStyle w:val="ListBullet"/>
+      </w:pPr>
+      <w:r>
+        <w:t>organizar o caixa;</w:t>
+      </w:r>
+    </w:p>
+    <w:p>
+      <w:pPr>
+        <w:pStyle w:val="ListBullet"/>
+      </w:pPr>
+      <w:r>
+        <w:t>vender produtos e serviços;</w:t>
+      </w:r>
+    </w:p>
+    <w:p>
+      <w:pPr>
+        <w:pStyle w:val="ListBullet"/>
+      </w:pPr>
+      <w:r>
+        <w:t>acompanhar avaliações físicas;</w:t>
+      </w:r>
+    </w:p>
+    <w:p>
+      <w:pPr>
+        <w:pStyle w:val="ListBullet"/>
+      </w:pPr>
+      <w:r>
+        <w:t>proteger dados com backup;</w:t>
+      </w:r>
+    </w:p>
+    <w:p>
+      <w:pPr>
+        <w:pStyle w:val="ListBullet"/>
+      </w:pPr>
+      <w:r>
+        <w:t>acompanhar o ginásio remotamente;</w:t>
+      </w:r>
+    </w:p>
+    <w:p>
+      <w:pPr>
+        <w:pStyle w:val="ListBullet"/>
+      </w:pPr>
+      <w:r>
+        <w:t>comunicar com clientes por SMS;</w:t>
+      </w:r>
+    </w:p>
+    <w:p>
+      <w:pPr>
+        <w:pStyle w:val="ListBullet"/>
+      </w:pPr>
+      <w:r>
+        <w:t>atribuir bónus e campanhas;</w:t>
+      </w:r>
+    </w:p>
+    <w:p>
+      <w:pPr>
+        <w:pStyle w:val="ListBullet"/>
+      </w:pPr>
+      <w:r>
+        <w:t>oferecer aplicativo mobile aos utentes.</w:t>
+      </w:r>
+    </w:p>
+    <w:p>
+      <w:pPr>
+        <w:pStyle w:val="Heading1"/>
+      </w:pPr>
+      <w:r>
+        <w:t>8. Por que começar pela Etapa 1</w:t>
+      </w:r>
+    </w:p>
+    <w:p>
+      <w:r>
+        <w:rPr>
+          <w:b w:val="0"/>
+          <w:i w:val="0"/>
+        </w:rPr>
+        <w:t>A Etapa 1 deve ser a prioridade porque entrega a base operacional do ginásio. Com ela, a DP Gym já poderá organizar os processos principais e validar o sistema na prática.</w:t>
+      </w:r>
+    </w:p>
+    <w:p>
+      <w:r>
+        <w:rPr>
+          <w:b w:val="0"/>
+          <w:i w:val="0"/>
+        </w:rPr>
+        <w:t>Depois da base estar estável, faz mais sentido avançar para painel web, CRM, SMS e aplicativo mobile.</w:t>
+      </w:r>
+    </w:p>
+    <w:p>
+      <w:pPr>
+        <w:pStyle w:val="Heading1"/>
+      </w:pPr>
+      <w:r>
+        <w:t>9. Resumo final para o cliente</w:t>
+      </w:r>
+    </w:p>
+    <w:p>
+      <w:r>
+        <w:rPr>
+          <w:b w:val="0"/>
+          <w:i w:val="0"/>
+        </w:rPr>
+        <w:t>A proposta é criar um sistema que ajude a DP Gym a deixar de depender de controlos manuais e passe a gerir a operação com mais segurança, organização e profissionalismo.</w:t>
+      </w:r>
+    </w:p>
+    <w:p>
+      <w:r>
+        <w:rPr>
+          <w:b w:val="0"/>
+          <w:i w:val="0"/>
+        </w:rPr>
+        <w:t>Primeiro será entregue o sistema interno do ginásio. Depois, a solução evoluirá para acompanhamento remoto, relacionamento com clientes e, por fim, aplicativo mobile para os utentes.</w:t>
+      </w:r>
+    </w:p>
+    <w:p>
+      <w:r>
+        <w:rPr>
+          <w:b/>
+          <w:i w:val="0"/>
+        </w:rPr>
+        <w:t>Resumo das estimativas:</w:t>
+      </w:r>
+    </w:p>
+    <w:p>
+      <w:pPr>
+        <w:pStyle w:val="ListBullet"/>
+      </w:pPr>
+      <w:r>
+        <w:t>Etapa 1: 25 a 40 dias de trabalho.</w:t>
+      </w:r>
+    </w:p>
+    <w:p>
+      <w:pPr>
+        <w:pStyle w:val="ListBullet"/>
+      </w:pPr>
+      <w:r>
+        <w:t>Etapa 2: 25 a 40 dias de trabalho.</w:t>
+      </w:r>
+    </w:p>
+    <w:p>
+      <w:pPr>
+        <w:pStyle w:val="ListBullet"/>
+      </w:pPr>
+      <w:r>
+        <w:t>Etapa 3: 20 a 30 dias de trabalho.</w:t>
+      </w:r>
+    </w:p>
+    <w:p>
+      <w:pPr>
+        <w:pStyle w:val="ListBullet"/>
+      </w:pPr>
+      <w:r>
+        <w:t>Total: 70 a 110 dias de trabalho.</w:t>
       </w:r>
     </w:p>
     <w:sectPr>
       <w:pgSz w:w="12240" w:h="15840"/>
-      <w:pgMar w:top="1008" w:right="1152" w:bottom="1008" w:left="1152" w:header="720" w:footer="720" w:gutter="0"/>
+      <w:pgMar w:top="936" w:right="1080" w:bottom="936" w:left="1080" w:header="720" w:footer="720" w:gutter="0"/>
       <w:cols w:space="720"/>
       <w:docGrid w:linePitch="360"/>
     </w:sectPr>
@@ -1499,10 +2900,11 @@
       <w:outlineLvl w:val="2"/>
     </w:pPr>
     <w:rPr>
-      <w:rFonts w:asciiTheme="majorHAnsi" w:eastAsiaTheme="majorEastAsia" w:hAnsiTheme="majorHAnsi" w:cstheme="majorBidi"/>
+      <w:rFonts w:asciiTheme="majorHAnsi" w:eastAsiaTheme="majorEastAsia" w:hAnsiTheme="majorHAnsi" w:cstheme="majorBidi" w:ascii="Aptos Display" w:hAnsi="Aptos Display"/>
       <w:b/>
       <w:bCs/>
       <w:color w:val="4F81BD" w:themeColor="accent1"/>
+      <w:sz w:val="23"/>
     </w:rPr>
   </w:style>
   <w:style w:type="paragraph" w:styleId="Heading4">

</xml_diff>